<commit_message>
bah, barely any progress
</commit_message>
<xml_diff>
--- a/ABET essay.docx
+++ b/ABET essay.docx
@@ -80,6 +80,67 @@
     <w:p/>
     <w:p>
       <w:r>
+        <w:t xml:space="preserve">USAFA’s mandate includes providing an exceptional education and recognition as a recognized elite academic institution. ABET accreditation provides credible </w:t>
+      </w:r>
+      <w:r>
+        <w:t xml:space="preserve">evidence of the excellence USAFA already strives to achieve. The Engineering Division completes periodic ABET visits to maintain accreditation. The Permanent Professor of Astronautics ensures program accreditation by hiring qualified faculty and ensuring the Department meets all ABET program guidelines. </w:t>
+      </w:r>
+    </w:p>
+    <w:p>
+      <w:r>
+        <w:t xml:space="preserve">My experience and education qualify me to teach Astronautical Engineering and have prepared me well to oversee the Department’s ongoing accreditation (/excellence). </w:t>
+      </w:r>
+    </w:p>
+    <w:p>
+      <w:r>
+        <w:t xml:space="preserve">I have three relevant ABET-accredited engineering degrees. </w:t>
+      </w:r>
+    </w:p>
+    <w:p>
+      <w:pPr>
+        <w:pStyle w:val="ListParagraph"/>
+        <w:numPr>
+          <w:ilvl w:val="0"/>
+          <w:numId w:val="5"/>
+        </w:numPr>
+      </w:pPr>
+      <w:r>
+        <w:t xml:space="preserve">A BS in Engineering Mechanics (USAFA, 2006) prepared me for hands-on engineering work in Air Force assignments. </w:t>
+      </w:r>
+    </w:p>
+    <w:p>
+      <w:pPr>
+        <w:pStyle w:val="ListParagraph"/>
+        <w:numPr>
+          <w:ilvl w:val="0"/>
+          <w:numId w:val="5"/>
+        </w:numPr>
+      </w:pPr>
+      <w:r>
+        <w:t xml:space="preserve">A MS in Astronautical Engineering provided depth </w:t>
+      </w:r>
+    </w:p>
+    <w:p>
+      <w:r>
+        <w:t xml:space="preserve"> Department of Astronautics hires qualified faculty members and undergoes periodic accreditation visits. The </w:t>
+      </w:r>
+    </w:p>
+    <w:p/>
+    <w:p/>
+    <w:p>
+      <w:r>
+        <w:t xml:space="preserve"> that end, USAFA’s Astronautical Engineering program </w:t>
+      </w:r>
+      <w:proofErr w:type="spellStart"/>
+      <w:r>
+        <w:t>recives</w:t>
+      </w:r>
+      <w:proofErr w:type="spellEnd"/>
+    </w:p>
+    <w:p/>
+    <w:p/>
+    <w:p>
+      <w:r>
         <w:t>Exceptional education through accredited…</w:t>
       </w:r>
     </w:p>
@@ -100,6 +161,7 @@
     </w:p>
     <w:p>
       <w:r>
+        <w:lastRenderedPageBreak/>
         <w:t>Recognized elite academic institution</w:t>
       </w:r>
     </w:p>
@@ -160,72 +222,45 @@
     </w:p>
     <w:p>
       <w:r>
-        <w:t xml:space="preserve">At Holloman AFB, my first jobs provided hands-on engineering experience that have informed </w:t>
-      </w:r>
-      <w:proofErr w:type="gramStart"/>
-      <w:r>
-        <w:t>all of</w:t>
-      </w:r>
-      <w:proofErr w:type="gramEnd"/>
-      <w:r>
-        <w:t xml:space="preserve"> my engineering thinking since, including a test mindset. This gave me a </w:t>
-      </w:r>
+        <w:t xml:space="preserve">At Holloman AFB, my first jobs provided hands-on engineering experience that have informed all of my engineering thinking since, including a test mindset. This gave me a passion for hands-on engineering education that I have brought to USAFA and incorporated into multiple classes. </w:t>
+      </w:r>
+    </w:p>
+    <w:p>
+      <w:r>
+        <w:t xml:space="preserve">At Los Angeles AFB I performed my first jobs in space. I learned rapidly and developed a love for space. Despite being at a program office, both jobs I filled uniquely involved frequent on-site work with missile warning operators (2 SWS). </w:t>
+      </w:r>
+    </w:p>
+    <w:p>
+      <w:r>
+        <w:t>My Defense Intelligence Agency job provided valuable experience leading a small team</w:t>
+      </w:r>
+      <w:r>
+        <w:t xml:space="preserve">. </w:t>
+      </w:r>
+    </w:p>
+    <w:p>
+      <w:r>
+        <w:t>My educational qualifications:</w:t>
+      </w:r>
+    </w:p>
+    <w:p>
+      <w:r>
+        <w:t xml:space="preserve">3 ABET-accredited degrees. </w:t>
+      </w:r>
+    </w:p>
+    <w:p>
+      <w:r>
+        <w:t xml:space="preserve">USAFA Engineering Mechanics degree foundational to the way I think as an engineer and prepared me well for my flight test work. </w:t>
+      </w:r>
+    </w:p>
+    <w:p>
+      <w:r>
+        <w:t>AFIT Astronautical Engineering degree introduced me to space with its inherently interdisciplinary…</w:t>
+      </w:r>
+    </w:p>
+    <w:p>
       <w:r>
         <w:lastRenderedPageBreak/>
-        <w:t xml:space="preserve">passion for hands-on engineering education that I have brought to USAFA and incorporated into multiple classes. </w:t>
-      </w:r>
-    </w:p>
-    <w:p>
-      <w:r>
-        <w:t xml:space="preserve">At Los Angeles AFB I performed my first </w:t>
-      </w:r>
-      <w:proofErr w:type="gramStart"/>
-      <w:r>
-        <w:t>jobs</w:t>
-      </w:r>
-      <w:proofErr w:type="gramEnd"/>
-      <w:r>
-        <w:t xml:space="preserve"> in space. I learned rapidly and developed a love for space. Despite being at a program office, both jobs I filled uniquely involved frequent on-site work with missile warning operators (2 SWS). </w:t>
-      </w:r>
-    </w:p>
-    <w:p>
-      <w:r>
-        <w:t>My Defense Intelligence Agency job provided valuable experience leading a small team</w:t>
-      </w:r>
-      <w:r>
-        <w:t xml:space="preserve">. </w:t>
-      </w:r>
-    </w:p>
-    <w:p>
-      <w:r>
-        <w:t>My educational qualifications:</w:t>
-      </w:r>
-    </w:p>
-    <w:p>
-      <w:r>
-        <w:t xml:space="preserve">3 ABET-accredited degrees. </w:t>
-      </w:r>
-    </w:p>
-    <w:p>
-      <w:r>
-        <w:t xml:space="preserve">USAFA Engineering Mechanics degree </w:t>
-      </w:r>
-      <w:proofErr w:type="gramStart"/>
-      <w:r>
-        <w:t>foundational</w:t>
-      </w:r>
-      <w:proofErr w:type="gramEnd"/>
-      <w:r>
-        <w:t xml:space="preserve"> to the way I think as an engineer and prepared me well for my flight test work. </w:t>
-      </w:r>
-    </w:p>
-    <w:p>
-      <w:r>
-        <w:t>AFIT Astronautical Engineering degree introduced me to space with its inherently interdisciplinary…</w:t>
-      </w:r>
-    </w:p>
-    <w:p>
-      <w:r>
         <w:t xml:space="preserve">NCSU Aerospace Engineering gave me freedom to deeply investigate one problem. In addition to the academics, it was an explicit leadership challenge in many ways. I led a team of XX people to put together my research project. I coordinated last-minute support of AFROCT Det 595 when CC got fired. </w:t>
       </w:r>
     </w:p>
@@ -363,15 +398,7 @@
       </w:r>
       <w:r>
         <w:lastRenderedPageBreak/>
-        <w:t xml:space="preserve">Excellence in engineering education cannot be a static endeavor. In addition to the ongoing work of developing faculty, the Department must continually stay abreast of changes in a </w:t>
-      </w:r>
-      <w:proofErr w:type="gramStart"/>
-      <w:r>
-        <w:t>rapidly-developing</w:t>
-      </w:r>
-      <w:proofErr w:type="gramEnd"/>
-      <w:r>
-        <w:t xml:space="preserve"> field. </w:t>
+        <w:t xml:space="preserve">Excellence in engineering education cannot be a static endeavor. In addition to the ongoing work of developing faculty, the Department must continually stay abreast of changes in a rapidly-developing field. </w:t>
       </w:r>
     </w:p>
     <w:p>
@@ -511,6 +538,232 @@
     </w:lvl>
   </w:abstractNum>
   <w:abstractNum w:abstractNumId="1" w15:restartNumberingAfterBreak="0">
+    <w:nsid w:val="45784098"/>
+    <w:multiLevelType w:val="hybridMultilevel"/>
+    <w:tmpl w:val="7E6ECEA0"/>
+    <w:lvl w:ilvl="0" w:tplc="04090001">
+      <w:start w:val="1"/>
+      <w:numFmt w:val="bullet"/>
+      <w:lvlText w:val=""/>
+      <w:lvlJc w:val="left"/>
+      <w:pPr>
+        <w:ind w:left="720" w:hanging="360"/>
+      </w:pPr>
+      <w:rPr>
+        <w:rFonts w:ascii="Symbol" w:hAnsi="Symbol" w:hint="default"/>
+      </w:rPr>
+    </w:lvl>
+    <w:lvl w:ilvl="1" w:tplc="04090003" w:tentative="1">
+      <w:start w:val="1"/>
+      <w:numFmt w:val="bullet"/>
+      <w:lvlText w:val="o"/>
+      <w:lvlJc w:val="left"/>
+      <w:pPr>
+        <w:ind w:left="1440" w:hanging="360"/>
+      </w:pPr>
+      <w:rPr>
+        <w:rFonts w:ascii="Courier New" w:hAnsi="Courier New" w:cs="Courier New" w:hint="default"/>
+      </w:rPr>
+    </w:lvl>
+    <w:lvl w:ilvl="2" w:tplc="04090005" w:tentative="1">
+      <w:start w:val="1"/>
+      <w:numFmt w:val="bullet"/>
+      <w:lvlText w:val=""/>
+      <w:lvlJc w:val="left"/>
+      <w:pPr>
+        <w:ind w:left="2160" w:hanging="360"/>
+      </w:pPr>
+      <w:rPr>
+        <w:rFonts w:ascii="Wingdings" w:hAnsi="Wingdings" w:hint="default"/>
+      </w:rPr>
+    </w:lvl>
+    <w:lvl w:ilvl="3" w:tplc="04090001" w:tentative="1">
+      <w:start w:val="1"/>
+      <w:numFmt w:val="bullet"/>
+      <w:lvlText w:val=""/>
+      <w:lvlJc w:val="left"/>
+      <w:pPr>
+        <w:ind w:left="2880" w:hanging="360"/>
+      </w:pPr>
+      <w:rPr>
+        <w:rFonts w:ascii="Symbol" w:hAnsi="Symbol" w:hint="default"/>
+      </w:rPr>
+    </w:lvl>
+    <w:lvl w:ilvl="4" w:tplc="04090003" w:tentative="1">
+      <w:start w:val="1"/>
+      <w:numFmt w:val="bullet"/>
+      <w:lvlText w:val="o"/>
+      <w:lvlJc w:val="left"/>
+      <w:pPr>
+        <w:ind w:left="3600" w:hanging="360"/>
+      </w:pPr>
+      <w:rPr>
+        <w:rFonts w:ascii="Courier New" w:hAnsi="Courier New" w:cs="Courier New" w:hint="default"/>
+      </w:rPr>
+    </w:lvl>
+    <w:lvl w:ilvl="5" w:tplc="04090005" w:tentative="1">
+      <w:start w:val="1"/>
+      <w:numFmt w:val="bullet"/>
+      <w:lvlText w:val=""/>
+      <w:lvlJc w:val="left"/>
+      <w:pPr>
+        <w:ind w:left="4320" w:hanging="360"/>
+      </w:pPr>
+      <w:rPr>
+        <w:rFonts w:ascii="Wingdings" w:hAnsi="Wingdings" w:hint="default"/>
+      </w:rPr>
+    </w:lvl>
+    <w:lvl w:ilvl="6" w:tplc="04090001" w:tentative="1">
+      <w:start w:val="1"/>
+      <w:numFmt w:val="bullet"/>
+      <w:lvlText w:val=""/>
+      <w:lvlJc w:val="left"/>
+      <w:pPr>
+        <w:ind w:left="5040" w:hanging="360"/>
+      </w:pPr>
+      <w:rPr>
+        <w:rFonts w:ascii="Symbol" w:hAnsi="Symbol" w:hint="default"/>
+      </w:rPr>
+    </w:lvl>
+    <w:lvl w:ilvl="7" w:tplc="04090003" w:tentative="1">
+      <w:start w:val="1"/>
+      <w:numFmt w:val="bullet"/>
+      <w:lvlText w:val="o"/>
+      <w:lvlJc w:val="left"/>
+      <w:pPr>
+        <w:ind w:left="5760" w:hanging="360"/>
+      </w:pPr>
+      <w:rPr>
+        <w:rFonts w:ascii="Courier New" w:hAnsi="Courier New" w:cs="Courier New" w:hint="default"/>
+      </w:rPr>
+    </w:lvl>
+    <w:lvl w:ilvl="8" w:tplc="04090005" w:tentative="1">
+      <w:start w:val="1"/>
+      <w:numFmt w:val="bullet"/>
+      <w:lvlText w:val=""/>
+      <w:lvlJc w:val="left"/>
+      <w:pPr>
+        <w:ind w:left="6480" w:hanging="360"/>
+      </w:pPr>
+      <w:rPr>
+        <w:rFonts w:ascii="Wingdings" w:hAnsi="Wingdings" w:hint="default"/>
+      </w:rPr>
+    </w:lvl>
+  </w:abstractNum>
+  <w:abstractNum w:abstractNumId="2" w15:restartNumberingAfterBreak="0">
+    <w:nsid w:val="65BB0752"/>
+    <w:multiLevelType w:val="hybridMultilevel"/>
+    <w:tmpl w:val="02A823BA"/>
+    <w:lvl w:ilvl="0" w:tplc="04090001">
+      <w:start w:val="1"/>
+      <w:numFmt w:val="bullet"/>
+      <w:lvlText w:val=""/>
+      <w:lvlJc w:val="left"/>
+      <w:pPr>
+        <w:ind w:left="720" w:hanging="360"/>
+      </w:pPr>
+      <w:rPr>
+        <w:rFonts w:ascii="Symbol" w:hAnsi="Symbol" w:hint="default"/>
+      </w:rPr>
+    </w:lvl>
+    <w:lvl w:ilvl="1" w:tplc="04090003" w:tentative="1">
+      <w:start w:val="1"/>
+      <w:numFmt w:val="bullet"/>
+      <w:lvlText w:val="o"/>
+      <w:lvlJc w:val="left"/>
+      <w:pPr>
+        <w:ind w:left="1440" w:hanging="360"/>
+      </w:pPr>
+      <w:rPr>
+        <w:rFonts w:ascii="Courier New" w:hAnsi="Courier New" w:cs="Courier New" w:hint="default"/>
+      </w:rPr>
+    </w:lvl>
+    <w:lvl w:ilvl="2" w:tplc="04090005" w:tentative="1">
+      <w:start w:val="1"/>
+      <w:numFmt w:val="bullet"/>
+      <w:lvlText w:val=""/>
+      <w:lvlJc w:val="left"/>
+      <w:pPr>
+        <w:ind w:left="2160" w:hanging="360"/>
+      </w:pPr>
+      <w:rPr>
+        <w:rFonts w:ascii="Wingdings" w:hAnsi="Wingdings" w:hint="default"/>
+      </w:rPr>
+    </w:lvl>
+    <w:lvl w:ilvl="3" w:tplc="04090001" w:tentative="1">
+      <w:start w:val="1"/>
+      <w:numFmt w:val="bullet"/>
+      <w:lvlText w:val=""/>
+      <w:lvlJc w:val="left"/>
+      <w:pPr>
+        <w:ind w:left="2880" w:hanging="360"/>
+      </w:pPr>
+      <w:rPr>
+        <w:rFonts w:ascii="Symbol" w:hAnsi="Symbol" w:hint="default"/>
+      </w:rPr>
+    </w:lvl>
+    <w:lvl w:ilvl="4" w:tplc="04090003" w:tentative="1">
+      <w:start w:val="1"/>
+      <w:numFmt w:val="bullet"/>
+      <w:lvlText w:val="o"/>
+      <w:lvlJc w:val="left"/>
+      <w:pPr>
+        <w:ind w:left="3600" w:hanging="360"/>
+      </w:pPr>
+      <w:rPr>
+        <w:rFonts w:ascii="Courier New" w:hAnsi="Courier New" w:cs="Courier New" w:hint="default"/>
+      </w:rPr>
+    </w:lvl>
+    <w:lvl w:ilvl="5" w:tplc="04090005" w:tentative="1">
+      <w:start w:val="1"/>
+      <w:numFmt w:val="bullet"/>
+      <w:lvlText w:val=""/>
+      <w:lvlJc w:val="left"/>
+      <w:pPr>
+        <w:ind w:left="4320" w:hanging="360"/>
+      </w:pPr>
+      <w:rPr>
+        <w:rFonts w:ascii="Wingdings" w:hAnsi="Wingdings" w:hint="default"/>
+      </w:rPr>
+    </w:lvl>
+    <w:lvl w:ilvl="6" w:tplc="04090001" w:tentative="1">
+      <w:start w:val="1"/>
+      <w:numFmt w:val="bullet"/>
+      <w:lvlText w:val=""/>
+      <w:lvlJc w:val="left"/>
+      <w:pPr>
+        <w:ind w:left="5040" w:hanging="360"/>
+      </w:pPr>
+      <w:rPr>
+        <w:rFonts w:ascii="Symbol" w:hAnsi="Symbol" w:hint="default"/>
+      </w:rPr>
+    </w:lvl>
+    <w:lvl w:ilvl="7" w:tplc="04090003" w:tentative="1">
+      <w:start w:val="1"/>
+      <w:numFmt w:val="bullet"/>
+      <w:lvlText w:val="o"/>
+      <w:lvlJc w:val="left"/>
+      <w:pPr>
+        <w:ind w:left="5760" w:hanging="360"/>
+      </w:pPr>
+      <w:rPr>
+        <w:rFonts w:ascii="Courier New" w:hAnsi="Courier New" w:cs="Courier New" w:hint="default"/>
+      </w:rPr>
+    </w:lvl>
+    <w:lvl w:ilvl="8" w:tplc="04090005" w:tentative="1">
+      <w:start w:val="1"/>
+      <w:numFmt w:val="bullet"/>
+      <w:lvlText w:val=""/>
+      <w:lvlJc w:val="left"/>
+      <w:pPr>
+        <w:ind w:left="6480" w:hanging="360"/>
+      </w:pPr>
+      <w:rPr>
+        <w:rFonts w:ascii="Wingdings" w:hAnsi="Wingdings" w:hint="default"/>
+      </w:rPr>
+    </w:lvl>
+  </w:abstractNum>
+  <w:abstractNum w:abstractNumId="3" w15:restartNumberingAfterBreak="0">
     <w:nsid w:val="697D2511"/>
     <w:multiLevelType w:val="hybridMultilevel"/>
     <w:tmpl w:val="F766A29E"/>
@@ -623,7 +876,7 @@
       </w:rPr>
     </w:lvl>
   </w:abstractNum>
-  <w:abstractNum w:abstractNumId="2" w15:restartNumberingAfterBreak="0">
+  <w:abstractNum w:abstractNumId="4" w15:restartNumberingAfterBreak="0">
     <w:nsid w:val="6EBB510B"/>
     <w:multiLevelType w:val="hybridMultilevel"/>
     <w:tmpl w:val="5D60882E"/>
@@ -740,9 +993,15 @@
     <w:abstractNumId w:val="0"/>
   </w:num>
   <w:num w:numId="2" w16cid:durableId="881331341">
+    <w:abstractNumId w:val="3"/>
+  </w:num>
+  <w:num w:numId="3" w16cid:durableId="1064914100">
+    <w:abstractNumId w:val="4"/>
+  </w:num>
+  <w:num w:numId="4" w16cid:durableId="624897245">
     <w:abstractNumId w:val="1"/>
   </w:num>
-  <w:num w:numId="3" w16cid:durableId="1064914100">
+  <w:num w:numId="5" w16cid:durableId="42560358">
     <w:abstractNumId w:val="2"/>
   </w:num>
 </w:numbering>

</xml_diff>

<commit_message>
nearly done with rough draft
</commit_message>
<xml_diff>
--- a/ABET essay.docx
+++ b/ABET essay.docx
@@ -2,6 +2,582 @@
 <file path=word/document.xml><?xml version="1.0" encoding="utf-8"?>
 <w:document xmlns:wpc="http://schemas.microsoft.com/office/word/2010/wordprocessingCanvas" xmlns:cx="http://schemas.microsoft.com/office/drawing/2014/chartex" xmlns:cx1="http://schemas.microsoft.com/office/drawing/2015/9/8/chartex" xmlns:cx2="http://schemas.microsoft.com/office/drawing/2015/10/21/chartex" xmlns:cx3="http://schemas.microsoft.com/office/drawing/2016/5/9/chartex" xmlns:cx4="http://schemas.microsoft.com/office/drawing/2016/5/10/chartex" xmlns:cx5="http://schemas.microsoft.com/office/drawing/2016/5/11/chartex" xmlns:cx6="http://schemas.microsoft.com/office/drawing/2016/5/12/chartex" xmlns:cx7="http://schemas.microsoft.com/office/drawing/2016/5/13/chartex" xmlns:cx8="http://schemas.microsoft.com/office/drawing/2016/5/14/chartex" xmlns:mc="http://schemas.openxmlformats.org/markup-compatibility/2006" xmlns:aink="http://schemas.microsoft.com/office/drawing/2016/ink" xmlns:am3d="http://schemas.microsoft.com/office/drawing/2017/model3d" xmlns:o="urn:schemas-microsoft-com:office:office" xmlns:oel="http://schemas.microsoft.com/office/2019/extlst" xmlns:r="http://schemas.openxmlformats.org/officeDocument/2006/relationships" xmlns:m="http://schemas.openxmlformats.org/officeDocument/2006/math" xmlns:v="urn:schemas-microsoft-com:vml" xmlns:wp14="http://schemas.microsoft.com/office/word/2010/wordprocessingDrawing" xmlns:wp="http://schemas.openxmlformats.org/drawingml/2006/wordprocessingDrawing" xmlns:w10="urn:schemas-microsoft-com:office:word" xmlns:w="http://schemas.openxmlformats.org/wordprocessingml/2006/main" xmlns:w14="http://schemas.microsoft.com/office/word/2010/wordml" xmlns:w15="http://schemas.microsoft.com/office/word/2012/wordml" xmlns:w16cex="http://schemas.microsoft.com/office/word/2018/wordml/cex" xmlns:w16cid="http://schemas.microsoft.com/office/word/2016/wordml/cid" xmlns:w16="http://schemas.microsoft.com/office/word/2018/wordml" xmlns:w16du="http://schemas.microsoft.com/office/word/2023/wordml/word16du" xmlns:w16sdtdh="http://schemas.microsoft.com/office/word/2020/wordml/sdtdatahash" xmlns:w16sdtfl="http://schemas.microsoft.com/office/word/2024/wordml/sdtformatlock" xmlns:w16se="http://schemas.microsoft.com/office/word/2015/wordml/symex" xmlns:wpg="http://schemas.microsoft.com/office/word/2010/wordprocessingGroup" xmlns:wpi="http://schemas.microsoft.com/office/word/2010/wordprocessingInk" xmlns:wne="http://schemas.microsoft.com/office/word/2006/wordml" xmlns:wps="http://schemas.microsoft.com/office/word/2010/wordprocessingShape" mc:Ignorable="w14 w15 w16se w16cid w16 w16cex w16sdtdh w16sdtfl w16du wp14">
   <w:body>
+    <w:p>
+      <w:r>
+        <w:t xml:space="preserve">USAFA’s mandate includes providing an exceptional education and recognition as a recognized elite academic institution. </w:t>
+      </w:r>
+      <w:r>
+        <w:t>The Engineering Division</w:t>
+      </w:r>
+      <w:r>
+        <w:t xml:space="preserve"> participates in</w:t>
+      </w:r>
+      <w:r>
+        <w:t xml:space="preserve"> periodic ABET visits </w:t>
+      </w:r>
+      <w:r>
+        <w:t xml:space="preserve">to maintain accreditation as a form of credible external validation of USAFA’s educational excellence. </w:t>
+      </w:r>
+      <w:r>
+        <w:t xml:space="preserve">The Permanent Professor of Astronautics ensures accreditation by hiring qualified faculty and ensuring the Department meets all program guidelines. My experience and education qualify me to teach Astronautical Engineering and have prepared me well to </w:t>
+      </w:r>
+      <w:r>
+        <w:t>lead</w:t>
+      </w:r>
+      <w:r>
+        <w:t xml:space="preserve"> the Department’s ongoing </w:t>
+      </w:r>
+      <w:r>
+        <w:t xml:space="preserve">pursuit of </w:t>
+      </w:r>
+      <w:r>
+        <w:t xml:space="preserve">excellence. </w:t>
+      </w:r>
+    </w:p>
+    <w:p/>
+    <w:p>
+      <w:r>
+        <w:t xml:space="preserve">I have three relevant ABET-accredited engineering degrees. </w:t>
+      </w:r>
+    </w:p>
+    <w:p>
+      <w:pPr>
+        <w:pStyle w:val="ListParagraph"/>
+        <w:numPr>
+          <w:ilvl w:val="0"/>
+          <w:numId w:val="5"/>
+        </w:numPr>
+      </w:pPr>
+      <w:r>
+        <w:t xml:space="preserve">BS in Engineering Mechanics (USAFA, 2006) </w:t>
+      </w:r>
+      <w:r>
+        <w:t xml:space="preserve">provided a foundation for engineering thinking and </w:t>
+      </w:r>
+      <w:r>
+        <w:t>prepared me for hands-on engineering in Air Force assignments</w:t>
+      </w:r>
+      <w:r>
+        <w:t>.</w:t>
+      </w:r>
+    </w:p>
+    <w:p>
+      <w:pPr>
+        <w:pStyle w:val="ListParagraph"/>
+        <w:numPr>
+          <w:ilvl w:val="0"/>
+          <w:numId w:val="5"/>
+        </w:numPr>
+      </w:pPr>
+      <w:r>
+        <w:t>MS in Astronautical Engineering</w:t>
+      </w:r>
+      <w:r>
+        <w:t xml:space="preserve"> (AFIT, 2011)</w:t>
+      </w:r>
+      <w:r>
+        <w:t xml:space="preserve"> introduced me to the basics of</w:t>
+      </w:r>
+      <w:r>
+        <w:t xml:space="preserve"> space</w:t>
+      </w:r>
+      <w:r>
+        <w:t xml:space="preserve"> engineering</w:t>
+      </w:r>
+      <w:r>
+        <w:t>.</w:t>
+      </w:r>
+    </w:p>
+    <w:p>
+      <w:pPr>
+        <w:pStyle w:val="ListParagraph"/>
+        <w:numPr>
+          <w:ilvl w:val="0"/>
+          <w:numId w:val="5"/>
+        </w:numPr>
+      </w:pPr>
+      <w:r>
+        <w:t xml:space="preserve">PhD in Aerospace Engineering gave me the freedom to pursue independent learning and </w:t>
+      </w:r>
+      <w:r>
+        <w:t xml:space="preserve">deep </w:t>
+      </w:r>
+      <w:r>
+        <w:t>expertise in spacecraft component testing</w:t>
+      </w:r>
+      <w:r>
+        <w:t>.</w:t>
+      </w:r>
+    </w:p>
+    <w:p>
+      <w:r>
+        <w:t>In addition, I have experience in engineering education from two teaching assignments at USAFA</w:t>
+      </w:r>
+      <w:r>
+        <w:t xml:space="preserve"> (</w:t>
+      </w:r>
+      <w:r>
+        <w:t>2014–2016</w:t>
+      </w:r>
+      <w:r>
+        <w:t xml:space="preserve">, </w:t>
+      </w:r>
+      <w:r>
+        <w:t>2022–present</w:t>
+      </w:r>
+      <w:r>
+        <w:t xml:space="preserve">) including instruction, assessment, and curriculum development. </w:t>
+      </w:r>
+    </w:p>
+    <w:p>
+      <w:pPr>
+        <w:pStyle w:val="ListParagraph"/>
+        <w:numPr>
+          <w:ilvl w:val="0"/>
+          <w:numId w:val="5"/>
+        </w:numPr>
+      </w:pPr>
+      <w:r>
+        <w:t>I i</w:t>
+      </w:r>
+      <w:r>
+        <w:t xml:space="preserve">nstructed six courses </w:t>
+      </w:r>
+      <w:r>
+        <w:t xml:space="preserve">in </w:t>
+      </w:r>
+      <w:r>
+        <w:t>two engineering departments</w:t>
+      </w:r>
+      <w:r>
+        <w:t xml:space="preserve"> and served as </w:t>
+      </w:r>
+      <w:r>
+        <w:t xml:space="preserve">course director </w:t>
+      </w:r>
+      <w:r>
+        <w:t>for four of them</w:t>
+      </w:r>
+      <w:r>
+        <w:t>.</w:t>
+      </w:r>
+    </w:p>
+    <w:p>
+      <w:pPr>
+        <w:pStyle w:val="ListParagraph"/>
+        <w:numPr>
+          <w:ilvl w:val="0"/>
+          <w:numId w:val="5"/>
+        </w:numPr>
+      </w:pPr>
+      <w:r>
+        <w:t xml:space="preserve">I was </w:t>
+      </w:r>
+      <w:r>
+        <w:t>Dept assessment officer for two years</w:t>
+      </w:r>
+      <w:r>
+        <w:t>, created mid-term review and annual metrics to support next ABET visit</w:t>
+      </w:r>
+      <w:r>
+        <w:t>.</w:t>
+      </w:r>
+    </w:p>
+    <w:p>
+      <w:pPr>
+        <w:pStyle w:val="ListParagraph"/>
+        <w:numPr>
+          <w:ilvl w:val="0"/>
+          <w:numId w:val="5"/>
+        </w:numPr>
+      </w:pPr>
+      <w:r>
+        <w:t>I l</w:t>
+      </w:r>
+      <w:r>
+        <w:t xml:space="preserve">ed </w:t>
+      </w:r>
+      <w:r>
+        <w:t xml:space="preserve">the Engineering Division’s 2024 </w:t>
+      </w:r>
+      <w:r>
+        <w:t>Engineering Program Advisory Council</w:t>
+      </w:r>
+      <w:r>
+        <w:t xml:space="preserve"> (EPAC)</w:t>
+      </w:r>
+      <w:r>
+        <w:t xml:space="preserve">, an </w:t>
+      </w:r>
+      <w:r>
+        <w:t>external review to ensure</w:t>
+      </w:r>
+      <w:r>
+        <w:t xml:space="preserve"> all</w:t>
+      </w:r>
+      <w:r>
+        <w:t xml:space="preserve"> USAFA’s engineering programs meet </w:t>
+      </w:r>
+      <w:r>
+        <w:t>USAF and USSF needs</w:t>
+      </w:r>
+      <w:r>
+        <w:t>.</w:t>
+      </w:r>
+    </w:p>
+    <w:p>
+      <w:pPr>
+        <w:pStyle w:val="ListParagraph"/>
+        <w:numPr>
+          <w:ilvl w:val="0"/>
+          <w:numId w:val="5"/>
+        </w:numPr>
+      </w:pPr>
+      <w:r>
+        <w:t>I coordinated a first discussion with the other 3 North American Universities that offer an accredited undergraduate Space Engineering degree.</w:t>
+      </w:r>
+    </w:p>
+    <w:p>
+      <w:r>
+        <w:t xml:space="preserve">My non-academic jobs have also prepared me to credibly lead an ABET-accredited engineering program. </w:t>
+      </w:r>
+    </w:p>
+    <w:p>
+      <w:pPr>
+        <w:pStyle w:val="ListParagraph"/>
+        <w:numPr>
+          <w:ilvl w:val="0"/>
+          <w:numId w:val="5"/>
+        </w:numPr>
+      </w:pPr>
+      <w:r>
+        <w:t>At Holloman AFB</w:t>
+      </w:r>
+      <w:r>
+        <w:t xml:space="preserve"> </w:t>
+      </w:r>
+      <w:r>
+        <w:t xml:space="preserve">I learned engineering practice performing </w:t>
+      </w:r>
+      <w:r>
+        <w:t>hands-</w:t>
+      </w:r>
+      <w:r>
+        <w:t>on work</w:t>
+      </w:r>
+      <w:r>
+        <w:t xml:space="preserve"> in flight test and rocket sled test</w:t>
+      </w:r>
+      <w:r>
+        <w:t>.</w:t>
+      </w:r>
+    </w:p>
+    <w:p>
+      <w:pPr>
+        <w:pStyle w:val="ListParagraph"/>
+        <w:numPr>
+          <w:ilvl w:val="0"/>
+          <w:numId w:val="5"/>
+        </w:numPr>
+      </w:pPr>
+      <w:r>
+        <w:t>At Los Angeles AFB I learned space acquisition and operations and cemented space lessons from AFIT</w:t>
+      </w:r>
+      <w:r>
+        <w:t>.</w:t>
+      </w:r>
+    </w:p>
+    <w:p>
+      <w:pPr>
+        <w:pStyle w:val="ListParagraph"/>
+        <w:numPr>
+          <w:ilvl w:val="0"/>
+          <w:numId w:val="5"/>
+        </w:numPr>
+      </w:pPr>
+      <w:r>
+        <w:lastRenderedPageBreak/>
+        <w:t>During a DIA assignment in Charlottesville VA I gained invaluable leadership experience, re-establishing a 20</w:t>
+      </w:r>
+      <w:r>
+        <w:t xml:space="preserve"> (</w:t>
+      </w:r>
+      <w:r>
+        <w:t>XX</w:t>
+      </w:r>
+      <w:r>
+        <w:t>!)</w:t>
+      </w:r>
+      <w:r>
+        <w:t>-person branch after COVID and fixing long-standing cultural problems</w:t>
+      </w:r>
+      <w:r>
+        <w:t>.</w:t>
+      </w:r>
+    </w:p>
+    <w:p>
+      <w:pPr>
+        <w:pStyle w:val="ListParagraph"/>
+        <w:numPr>
+          <w:ilvl w:val="0"/>
+          <w:numId w:val="5"/>
+        </w:numPr>
+      </w:pPr>
+      <w:r>
+        <w:t xml:space="preserve">As Acting </w:t>
+      </w:r>
+      <w:r>
+        <w:t xml:space="preserve">Cadet Squadron </w:t>
+      </w:r>
+      <w:r>
+        <w:t xml:space="preserve">Commander I </w:t>
+      </w:r>
+      <w:r>
+        <w:t xml:space="preserve">directly </w:t>
+      </w:r>
+      <w:r>
+        <w:t>fulfilled</w:t>
+      </w:r>
+      <w:r>
+        <w:t xml:space="preserve"> USAFA’s military education mission</w:t>
+      </w:r>
+      <w:r>
+        <w:t xml:space="preserve"> by leading 4 NCOs and 187 cadets</w:t>
+      </w:r>
+      <w:r>
+        <w:t>.</w:t>
+      </w:r>
+    </w:p>
+    <w:p/>
+    <w:p>
+      <w:r>
+        <w:t xml:space="preserve">Sustaining </w:t>
+      </w:r>
+      <w:r>
+        <w:t>the</w:t>
+      </w:r>
+      <w:r>
+        <w:t xml:space="preserve"> culture of educational </w:t>
+      </w:r>
+      <w:r>
+        <w:t>e</w:t>
+      </w:r>
+      <w:r>
+        <w:t>xcellence</w:t>
+      </w:r>
+      <w:r>
+        <w:t xml:space="preserve"> </w:t>
+      </w:r>
+      <w:r>
+        <w:t xml:space="preserve">necessary for ABET accreditation </w:t>
+      </w:r>
+      <w:r>
+        <w:t>requires continuous work</w:t>
+      </w:r>
+      <w:r>
+        <w:t xml:space="preserve">. </w:t>
+      </w:r>
+      <w:r>
+        <w:t xml:space="preserve">First, </w:t>
+      </w:r>
+      <w:r>
+        <w:t xml:space="preserve">the department must </w:t>
+      </w:r>
+      <w:r>
+        <w:t>continually</w:t>
+      </w:r>
+      <w:r>
+        <w:t xml:space="preserve"> recruit and develop</w:t>
+      </w:r>
+      <w:r>
+        <w:t xml:space="preserve"> </w:t>
+      </w:r>
+      <w:r>
+        <w:t xml:space="preserve">qualified </w:t>
+      </w:r>
+      <w:r>
+        <w:t>faculty</w:t>
+      </w:r>
+      <w:r>
+        <w:t xml:space="preserve"> members. </w:t>
+      </w:r>
+      <w:r>
+        <w:t>In addition, the</w:t>
+      </w:r>
+      <w:r>
+        <w:t xml:space="preserve"> department must balance the embrace of relevant changes in engineering practice with the need to maintain excellence in engineering fundamentals.</w:t>
+      </w:r>
+    </w:p>
+    <w:p>
+      <w:r>
+        <w:t>Personnel d</w:t>
+      </w:r>
+      <w:r>
+        <w:t>evelopment is a unique institutional challenge with the short-term nature of officer assignments</w:t>
+      </w:r>
+      <w:r>
+        <w:t xml:space="preserve">. And while it provides </w:t>
+      </w:r>
+      <w:r>
+        <w:t xml:space="preserve">a constant </w:t>
+      </w:r>
+      <w:r>
+        <w:t xml:space="preserve">infusion </w:t>
+      </w:r>
+      <w:r>
+        <w:t xml:space="preserve">of </w:t>
+      </w:r>
+      <w:r>
+        <w:t xml:space="preserve">fresh engineering practices, </w:t>
+      </w:r>
+      <w:r>
+        <w:t>sustainably incorporat</w:t>
+      </w:r>
+      <w:r>
+        <w:t>ing</w:t>
+      </w:r>
+      <w:r>
+        <w:t xml:space="preserve"> those practices into coursework</w:t>
+      </w:r>
+      <w:r>
+        <w:t xml:space="preserve"> requires focused and sustained effort</w:t>
+      </w:r>
+      <w:r>
+        <w:t xml:space="preserve">. I have significant experience identifying areas for improvement and updating courses to keep pace with engineering practice. </w:t>
+      </w:r>
+    </w:p>
+    <w:p>
+      <w:r>
+        <w:t xml:space="preserve">As course director of Astro 331 (Space Systems Engineering) I replaced legacy proprietary hardware </w:t>
+      </w:r>
+      <w:r>
+        <w:t xml:space="preserve">with modern equipment, which also required rewriting lab content. This update created </w:t>
+      </w:r>
+      <w:r>
+        <w:t xml:space="preserve">additional </w:t>
+      </w:r>
+      <w:r>
+        <w:t xml:space="preserve">opportunity for hands-on engineering, and provided </w:t>
+      </w:r>
+      <w:r>
+        <w:t>room</w:t>
+      </w:r>
+      <w:r>
+        <w:t xml:space="preserve"> for cadets to learn fundamental engineering concepts at a deeper level than before. </w:t>
+      </w:r>
+    </w:p>
+    <w:p>
+      <w:r>
+        <w:t xml:space="preserve">As Division EPAC coordinator, I identified a common </w:t>
+      </w:r>
+      <w:r>
+        <w:t xml:space="preserve">curriculum </w:t>
+      </w:r>
+      <w:r>
+        <w:t xml:space="preserve">shortfall in engineering communication. I </w:t>
+      </w:r>
+      <w:r>
+        <w:t xml:space="preserve">pursued a </w:t>
+      </w:r>
+      <w:r>
+        <w:t>mult</w:t>
+      </w:r>
+      <w:r>
+        <w:t>i-</w:t>
+      </w:r>
+      <w:r>
+        <w:t>semester</w:t>
+      </w:r>
+      <w:r>
+        <w:t xml:space="preserve"> effort</w:t>
+      </w:r>
+      <w:r>
+        <w:t xml:space="preserve"> to incorporate new material into the </w:t>
+      </w:r>
+      <w:r>
+        <w:t xml:space="preserve">Astronautical Engineering </w:t>
+      </w:r>
+      <w:r>
+        <w:t xml:space="preserve">major to address the problem, </w:t>
+      </w:r>
+      <w:r>
+        <w:t>leading</w:t>
+      </w:r>
+      <w:r>
+        <w:t xml:space="preserve"> the</w:t>
+      </w:r>
+      <w:r>
+        <w:t xml:space="preserve"> development of</w:t>
+      </w:r>
+      <w:r>
+        <w:t xml:space="preserve"> a multi-department Engr 495</w:t>
+      </w:r>
+      <w:r>
+        <w:t xml:space="preserve"> experimental course and promoting a Curriculum Change Proposal to incorporate Engr 201 (</w:t>
+      </w:r>
+      <w:r>
+        <w:t>Technology Skills and Communication for Engineers</w:t>
+      </w:r>
+      <w:r>
+        <w:t xml:space="preserve">) into USAFA’s Course of Instruction as a required class for two engineering majors, currently on track to begin in Fall 2026. </w:t>
+      </w:r>
+    </w:p>
+    <w:p/>
+    <w:p>
+      <w:r>
+        <w:t xml:space="preserve">USAFA has long been a recognized leader in space education. The Astronautical Engineering major </w:t>
+      </w:r>
+      <w:r>
+        <w:t>was the first of its kind to receive ABET accreditation in 1973. The program has also produced multiple foundational textbooks</w:t>
+      </w:r>
+      <w:r>
+        <w:t xml:space="preserve">. The department has also launched </w:t>
+      </w:r>
+      <w:r>
+        <w:t xml:space="preserve">a series of successful </w:t>
+      </w:r>
+      <w:proofErr w:type="spellStart"/>
+      <w:r>
+        <w:t>FalconSAT</w:t>
+      </w:r>
+      <w:proofErr w:type="spellEnd"/>
+      <w:r>
+        <w:t xml:space="preserve"> spacecraft that have introduced major engineering advances. </w:t>
+      </w:r>
+    </w:p>
+    <w:p>
+      <w:r>
+        <w:lastRenderedPageBreak/>
+        <w:t xml:space="preserve">If selected as USAFA’s Permanent Professor of Astronautics, I intend to continue the Department’s </w:t>
+      </w:r>
+      <w:r>
+        <w:t xml:space="preserve">cultural </w:t>
+      </w:r>
+      <w:r>
+        <w:t>legacy of excellence and leadership in space education</w:t>
+      </w:r>
+      <w:r>
+        <w:t xml:space="preserve">. </w:t>
+      </w:r>
+    </w:p>
+    <w:p/>
+    <w:p>
+      <w:r>
+        <w:t xml:space="preserve">While USAFA is well positioned to maintain its </w:t>
+      </w:r>
+      <w:r>
+        <w:t>cultural legacy of excellence and leadership in space education</w:t>
+      </w:r>
+      <w:r>
+        <w:t xml:space="preserve">, the Department must continue to stay abreast of several changes in the field. In the near term, USAFA needs a Curriculum Change Proposal to update the Course of Instruction with new program description language. </w:t>
+      </w:r>
+    </w:p>
+    <w:p/>
+    <w:p>
+      <w:r>
+        <w:br w:type="page"/>
+      </w:r>
+    </w:p>
     <w:p>
       <w:pPr>
         <w:pStyle w:val="ListParagraph"/>
@@ -11,6 +587,7 @@
         </w:numPr>
       </w:pPr>
       <w:r>
+        <w:lastRenderedPageBreak/>
         <w:t>Intro</w:t>
       </w:r>
     </w:p>
@@ -47,10 +624,7 @@
         </w:numPr>
       </w:pPr>
       <w:r>
-        <w:t>Constant evolution, recent changes</w:t>
-      </w:r>
-      <w:r>
-        <w:t xml:space="preserve"> to keep up with field</w:t>
+        <w:t>Constant evolution, recent changes to keep up with field</w:t>
       </w:r>
     </w:p>
     <w:p>
@@ -77,25 +651,18 @@
         <w:t>Upcoming changes</w:t>
       </w:r>
     </w:p>
+    <w:p>
+      <w:r>
+        <w:br w:type="page"/>
+      </w:r>
+    </w:p>
+    <w:p>
+      <w:r>
+        <w:lastRenderedPageBreak/>
+        <w:t xml:space="preserve">NCSU Aerospace Engineering gave me freedom to deeply investigate one problem. In addition to the academics, it was an explicit leadership challenge in many ways. I led a team of XX people to put together my research project. I coordinated last-minute support of AFROCT Det 595 when CC got fired. </w:t>
+      </w:r>
+    </w:p>
     <w:p/>
-    <w:p>
-      <w:r>
-        <w:t xml:space="preserve">USAFA’s mandate includes providing an exceptional education and recognition as a recognized elite academic institution. ABET accreditation provides credible </w:t>
-      </w:r>
-      <w:r>
-        <w:t xml:space="preserve">evidence of the excellence USAFA already strives to achieve. The Engineering Division completes periodic ABET visits to maintain accreditation. The Permanent Professor of Astronautics ensures program accreditation by hiring qualified faculty and ensuring the Department meets all ABET program guidelines. </w:t>
-      </w:r>
-    </w:p>
-    <w:p>
-      <w:r>
-        <w:t xml:space="preserve">My experience and education qualify me to teach Astronautical Engineering and have prepared me well to oversee the Department’s ongoing accreditation (/excellence). </w:t>
-      </w:r>
-    </w:p>
-    <w:p>
-      <w:r>
-        <w:t xml:space="preserve">I have three relevant ABET-accredited engineering degrees. </w:t>
-      </w:r>
-    </w:p>
     <w:p>
       <w:pPr>
         <w:pStyle w:val="ListParagraph"/>
@@ -105,8 +672,13 @@
         </w:numPr>
       </w:pPr>
       <w:r>
-        <w:t xml:space="preserve">A BS in Engineering Mechanics (USAFA, 2006) prepared me for hands-on engineering work in Air Force assignments. </w:t>
-      </w:r>
+        <w:t xml:space="preserve">Significantly overhauled Astro 331 Space Systems Engineering to </w:t>
+      </w:r>
+      <w:proofErr w:type="spellStart"/>
+      <w:r>
+        <w:t>asdfasdf</w:t>
+      </w:r>
+      <w:proofErr w:type="spellEnd"/>
     </w:p>
     <w:p>
       <w:pPr>
@@ -117,299 +689,7 @@
         </w:numPr>
       </w:pPr>
       <w:r>
-        <w:t xml:space="preserve">A MS in Astronautical Engineering provided depth </w:t>
-      </w:r>
-    </w:p>
-    <w:p>
-      <w:r>
-        <w:t xml:space="preserve"> Department of Astronautics hires qualified faculty members and undergoes periodic accreditation visits. The </w:t>
-      </w:r>
-    </w:p>
-    <w:p/>
-    <w:p/>
-    <w:p>
-      <w:r>
-        <w:t xml:space="preserve"> that end, USAFA’s Astronautical Engineering program </w:t>
-      </w:r>
-      <w:proofErr w:type="spellStart"/>
-      <w:r>
-        <w:t>recives</w:t>
-      </w:r>
-      <w:proofErr w:type="spellEnd"/>
-    </w:p>
-    <w:p/>
-    <w:p/>
-    <w:p>
-      <w:r>
-        <w:t>Exceptional education through accredited…</w:t>
-      </w:r>
-    </w:p>
-    <w:p>
-      <w:r>
-        <w:t>Desire for self-improvement</w:t>
-      </w:r>
-    </w:p>
-    <w:p>
-      <w:r>
-        <w:t>Rigorous academic majors</w:t>
-      </w:r>
-    </w:p>
-    <w:p>
-      <w:r>
-        <w:t>Elite college experience</w:t>
-      </w:r>
-    </w:p>
-    <w:p>
-      <w:r>
-        <w:lastRenderedPageBreak/>
-        <w:t>Recognized elite academic institution</w:t>
-      </w:r>
-    </w:p>
-    <w:p>
-      <w:pPr>
-        <w:tabs>
-          <w:tab w:val="center" w:pos="4680"/>
-        </w:tabs>
-      </w:pPr>
-      <w:r>
-        <w:t xml:space="preserve">USAFA’s academic mandate is to provide an exceptional education as a recognized elite academic institution. </w:t>
-      </w:r>
-      <w:r>
-        <w:br/>
-        <w:t>Owe students…</w:t>
-      </w:r>
-    </w:p>
-    <w:p>
-      <w:pPr>
-        <w:tabs>
-          <w:tab w:val="center" w:pos="4680"/>
-        </w:tabs>
-      </w:pPr>
-      <w:r>
-        <w:t>ABET accreditation demonstrates credibility…</w:t>
-      </w:r>
-    </w:p>
-    <w:p>
-      <w:pPr>
-        <w:tabs>
-          <w:tab w:val="center" w:pos="4680"/>
-        </w:tabs>
-      </w:pPr>
-      <w:r>
-        <w:t xml:space="preserve"> to ensure that our Astronautical Engineering </w:t>
-      </w:r>
-    </w:p>
-    <w:p>
-      <w:r>
-        <w:t>first ABET-accredited Astro degree, 1973</w:t>
-      </w:r>
-    </w:p>
-    <w:p>
-      <w:r>
-        <w:t>USAFA has been a leader in space, ABET accreditation provides external recognition…</w:t>
-      </w:r>
-    </w:p>
-    <w:p/>
-    <w:p>
-      <w:r>
-        <w:t xml:space="preserve">ABET Accreditation is the foundation of credibility for American Engineering Education. ABET requires that faculty have the qualifications and authority required to guide the program, and lists several criteria used for assessing faculty competence. I believe I have the qualifications and experience to excel at guiding USAFA’s Astronautics Faculty in continued excellence at offering America’s premiere undergraduate Astronautical Engineering program. </w:t>
-      </w:r>
-    </w:p>
-    <w:p>
-      <w:r>
-        <w:t xml:space="preserve">My career has been tailor-made to prepare me for this role, in both academic and operational (support? Non-academic) assignments. </w:t>
-      </w:r>
-    </w:p>
-    <w:p>
-      <w:r>
-        <w:t xml:space="preserve">At Holloman AFB, my first jobs provided hands-on engineering experience that have informed all of my engineering thinking since, including a test mindset. This gave me a passion for hands-on engineering education that I have brought to USAFA and incorporated into multiple classes. </w:t>
-      </w:r>
-    </w:p>
-    <w:p>
-      <w:r>
-        <w:t xml:space="preserve">At Los Angeles AFB I performed my first jobs in space. I learned rapidly and developed a love for space. Despite being at a program office, both jobs I filled uniquely involved frequent on-site work with missile warning operators (2 SWS). </w:t>
-      </w:r>
-    </w:p>
-    <w:p>
-      <w:r>
-        <w:t>My Defense Intelligence Agency job provided valuable experience leading a small team</w:t>
-      </w:r>
-      <w:r>
-        <w:t xml:space="preserve">. </w:t>
-      </w:r>
-    </w:p>
-    <w:p>
-      <w:r>
-        <w:t>My educational qualifications:</w:t>
-      </w:r>
-    </w:p>
-    <w:p>
-      <w:r>
-        <w:t xml:space="preserve">3 ABET-accredited degrees. </w:t>
-      </w:r>
-    </w:p>
-    <w:p>
-      <w:r>
-        <w:t xml:space="preserve">USAFA Engineering Mechanics degree foundational to the way I think as an engineer and prepared me well for my flight test work. </w:t>
-      </w:r>
-    </w:p>
-    <w:p>
-      <w:r>
-        <w:t>AFIT Astronautical Engineering degree introduced me to space with its inherently interdisciplinary…</w:t>
-      </w:r>
-    </w:p>
-    <w:p>
-      <w:r>
-        <w:lastRenderedPageBreak/>
-        <w:t xml:space="preserve">NCSU Aerospace Engineering gave me freedom to deeply investigate one problem. In addition to the academics, it was an explicit leadership challenge in many ways. I led a team of XX people to put together my research project. I coordinated last-minute support of AFROCT Det 595 when CC got fired. </w:t>
-      </w:r>
-    </w:p>
-    <w:p>
-      <w:r>
-        <w:t xml:space="preserve">Finally, I have spent several years developing teaching expertise, both classroom teaching and supporting the department, the program, and USAFA as an institution. </w:t>
-      </w:r>
-    </w:p>
-    <w:p>
-      <w:r>
-        <w:t xml:space="preserve">In my first USAFA assignment I focused on good course direction and instruction, including guest teaching in the Engineering Mechanics Department. </w:t>
-      </w:r>
-    </w:p>
-    <w:p>
-      <w:r>
-        <w:t xml:space="preserve">During my second assignment I </w:t>
-      </w:r>
-      <w:r>
-        <w:t xml:space="preserve">have </w:t>
-      </w:r>
-      <w:proofErr w:type="spellStart"/>
-      <w:r>
-        <w:t>asdfafd</w:t>
-      </w:r>
-      <w:proofErr w:type="spellEnd"/>
-    </w:p>
-    <w:p>
-      <w:r>
-        <w:br w:type="page"/>
-      </w:r>
-    </w:p>
-    <w:p>
-      <w:r>
-        <w:lastRenderedPageBreak/>
-        <w:t xml:space="preserve">Three ABET-accredited engineering degrees provide the foundation of my academic qualifications. </w:t>
-      </w:r>
-    </w:p>
-    <w:p>
-      <w:pPr>
-        <w:pStyle w:val="ListParagraph"/>
-        <w:numPr>
-          <w:ilvl w:val="0"/>
-          <w:numId w:val="2"/>
-        </w:numPr>
-      </w:pPr>
-      <w:r>
-        <w:t>BS in Engineering Mechanics served as a foundation to thinking like an engineer, and prepared me for hands-on engineering in my early assignments</w:t>
-      </w:r>
-    </w:p>
-    <w:p>
-      <w:pPr>
-        <w:pStyle w:val="ListParagraph"/>
-        <w:numPr>
-          <w:ilvl w:val="0"/>
-          <w:numId w:val="2"/>
-        </w:numPr>
-      </w:pPr>
-      <w:r>
-        <w:t xml:space="preserve">MS in Astronautical Engineering introduced me to space as a discipline, and the inherently interdisciplinary nature of space engineering. This degree also prepared me to quickly understand the space environment during my subsequent space assignments. </w:t>
-      </w:r>
-    </w:p>
-    <w:p>
-      <w:pPr>
-        <w:pStyle w:val="ListParagraph"/>
-        <w:numPr>
-          <w:ilvl w:val="0"/>
-          <w:numId w:val="2"/>
-        </w:numPr>
-      </w:pPr>
-      <w:r>
-        <w:t>PhD in Aerospace Engineering gave me the freedom to pursue depth and independence as I tackled a new problem, developed a spacecraft component, and led a team to develop and test it</w:t>
-      </w:r>
-    </w:p>
-    <w:p>
-      <w:r>
-        <w:t xml:space="preserve">I also have significant experience as an educator, developing expertise in the classroom and beyond. </w:t>
-      </w:r>
-    </w:p>
-    <w:p>
-      <w:pPr>
-        <w:pStyle w:val="ListParagraph"/>
-        <w:numPr>
-          <w:ilvl w:val="0"/>
-          <w:numId w:val="2"/>
-        </w:numPr>
-      </w:pPr>
-      <w:r>
-        <w:t>USAFA classroom instruction</w:t>
-      </w:r>
-    </w:p>
-    <w:p>
-      <w:pPr>
-        <w:pStyle w:val="ListParagraph"/>
-        <w:numPr>
-          <w:ilvl w:val="0"/>
-          <w:numId w:val="2"/>
-        </w:numPr>
-      </w:pPr>
-      <w:r>
-        <w:t>AT NCSU’s AFROTC Det 595 I coordinated among AFIT CI students to provide coverage of 3 semester-long classes…</w:t>
-      </w:r>
-    </w:p>
-    <w:p>
-      <w:pPr>
-        <w:pStyle w:val="ListParagraph"/>
-        <w:numPr>
-          <w:ilvl w:val="0"/>
-          <w:numId w:val="2"/>
-        </w:numPr>
-      </w:pPr>
-      <w:r>
-        <w:t>Course development</w:t>
-      </w:r>
-    </w:p>
-    <w:p>
-      <w:pPr>
-        <w:pStyle w:val="ListParagraph"/>
-        <w:numPr>
-          <w:ilvl w:val="0"/>
-          <w:numId w:val="2"/>
-        </w:numPr>
-      </w:pPr>
-      <w:r>
-        <w:t>Accreditation</w:t>
-      </w:r>
-    </w:p>
-    <w:p>
-      <w:pPr>
-        <w:pStyle w:val="ListParagraph"/>
-      </w:pPr>
-    </w:p>
-    <w:p>
-      <w:r>
-        <w:br w:type="page"/>
-      </w:r>
-      <w:r>
-        <w:lastRenderedPageBreak/>
-        <w:t xml:space="preserve">Excellence in engineering education cannot be a static endeavor. In addition to the ongoing work of developing faculty, the Department must continually stay abreast of changes in a rapidly-developing field. </w:t>
-      </w:r>
-    </w:p>
-    <w:p>
-      <w:r>
-        <w:t>As an instructor I have successfully introduced several changes into curriculum…</w:t>
-      </w:r>
-    </w:p>
-    <w:p/>
-    <w:p>
-      <w:r>
-        <w:t>Ongoing…</w:t>
+        <w:t xml:space="preserve">Created multi-department Engr 495 Technology Skills and Communication for Engineers to address an identified communication shortfall in the Astronautics curriculum. </w:t>
       </w:r>
     </w:p>
     <w:p/>
@@ -666,7 +946,7 @@
         <w:rFonts w:ascii="Symbol" w:hAnsi="Symbol" w:hint="default"/>
       </w:rPr>
     </w:lvl>
-    <w:lvl w:ilvl="1" w:tplc="04090003" w:tentative="1">
+    <w:lvl w:ilvl="1" w:tplc="04090003">
       <w:start w:val="1"/>
       <w:numFmt w:val="bullet"/>
       <w:lvlText w:val="o"/>
@@ -1407,6 +1687,7 @@
   <w:style w:type="paragraph" w:default="1" w:styleId="Normal">
     <w:name w:val="Normal"/>
     <w:qFormat/>
+    <w:rsid w:val="004053BB"/>
   </w:style>
   <w:style w:type="paragraph" w:styleId="Heading1">
     <w:name w:val="heading 1"/>

</xml_diff>

<commit_message>
what I sent to people for review--working on my other computer but forgot to push
</commit_message>
<xml_diff>
--- a/ABET essay.docx
+++ b/ABET essay.docx
@@ -3,94 +3,38 @@
 <w:document xmlns:wpc="http://schemas.microsoft.com/office/word/2010/wordprocessingCanvas" xmlns:cx="http://schemas.microsoft.com/office/drawing/2014/chartex" xmlns:cx1="http://schemas.microsoft.com/office/drawing/2015/9/8/chartex" xmlns:cx2="http://schemas.microsoft.com/office/drawing/2015/10/21/chartex" xmlns:cx3="http://schemas.microsoft.com/office/drawing/2016/5/9/chartex" xmlns:cx4="http://schemas.microsoft.com/office/drawing/2016/5/10/chartex" xmlns:cx5="http://schemas.microsoft.com/office/drawing/2016/5/11/chartex" xmlns:cx6="http://schemas.microsoft.com/office/drawing/2016/5/12/chartex" xmlns:cx7="http://schemas.microsoft.com/office/drawing/2016/5/13/chartex" xmlns:cx8="http://schemas.microsoft.com/office/drawing/2016/5/14/chartex" xmlns:mc="http://schemas.openxmlformats.org/markup-compatibility/2006" xmlns:aink="http://schemas.microsoft.com/office/drawing/2016/ink" xmlns:am3d="http://schemas.microsoft.com/office/drawing/2017/model3d" xmlns:o="urn:schemas-microsoft-com:office:office" xmlns:oel="http://schemas.microsoft.com/office/2019/extlst" xmlns:r="http://schemas.openxmlformats.org/officeDocument/2006/relationships" xmlns:m="http://schemas.openxmlformats.org/officeDocument/2006/math" xmlns:v="urn:schemas-microsoft-com:vml" xmlns:wp14="http://schemas.microsoft.com/office/word/2010/wordprocessingDrawing" xmlns:wp="http://schemas.openxmlformats.org/drawingml/2006/wordprocessingDrawing" xmlns:w10="urn:schemas-microsoft-com:office:word" xmlns:w="http://schemas.openxmlformats.org/wordprocessingml/2006/main" xmlns:w14="http://schemas.microsoft.com/office/word/2010/wordml" xmlns:w15="http://schemas.microsoft.com/office/word/2012/wordml" xmlns:w16cex="http://schemas.microsoft.com/office/word/2018/wordml/cex" xmlns:w16cid="http://schemas.microsoft.com/office/word/2016/wordml/cid" xmlns:w16="http://schemas.microsoft.com/office/word/2018/wordml" xmlns:w16du="http://schemas.microsoft.com/office/word/2023/wordml/word16du" xmlns:w16sdtdh="http://schemas.microsoft.com/office/word/2020/wordml/sdtdatahash" xmlns:w16sdtfl="http://schemas.microsoft.com/office/word/2024/wordml/sdtformatlock" xmlns:w16se="http://schemas.microsoft.com/office/word/2015/wordml/symex" xmlns:wpg="http://schemas.microsoft.com/office/word/2010/wordprocessingGroup" xmlns:wpi="http://schemas.microsoft.com/office/word/2010/wordprocessingInk" xmlns:wne="http://schemas.microsoft.com/office/word/2006/wordml" xmlns:wps="http://schemas.microsoft.com/office/word/2010/wordprocessingShape" mc:Ignorable="w14 w15 w16se w16cid w16 w16cex w16sdtdh w16sdtfl w16du wp14">
   <w:body>
     <w:p>
-      <w:pPr>
-        <w:pStyle w:val="ListParagraph"/>
-        <w:numPr>
-          <w:ilvl w:val="0"/>
-          <w:numId w:val="3"/>
-        </w:numPr>
-      </w:pPr>
-      <w:r>
-        <w:t>Intro</w:t>
-      </w:r>
-    </w:p>
-    <w:p>
-      <w:pPr>
-        <w:pStyle w:val="ListParagraph"/>
-        <w:numPr>
-          <w:ilvl w:val="0"/>
-          <w:numId w:val="3"/>
-        </w:numPr>
-      </w:pPr>
-      <w:r>
-        <w:t>My qualifications</w:t>
-      </w:r>
-    </w:p>
-    <w:p>
-      <w:pPr>
-        <w:pStyle w:val="ListParagraph"/>
-        <w:numPr>
-          <w:ilvl w:val="0"/>
-          <w:numId w:val="3"/>
-        </w:numPr>
-      </w:pPr>
-      <w:r>
-        <w:t>History and philosophy of accreditation</w:t>
-      </w:r>
-    </w:p>
-    <w:p>
-      <w:pPr>
-        <w:pStyle w:val="ListParagraph"/>
-        <w:numPr>
-          <w:ilvl w:val="0"/>
-          <w:numId w:val="3"/>
-        </w:numPr>
-      </w:pPr>
-      <w:r>
-        <w:t>Constant evolution, recent changes</w:t>
-      </w:r>
-      <w:r>
-        <w:t xml:space="preserve"> to keep up with field</w:t>
-      </w:r>
-    </w:p>
-    <w:p>
-      <w:pPr>
-        <w:pStyle w:val="ListParagraph"/>
-        <w:numPr>
-          <w:ilvl w:val="1"/>
-          <w:numId w:val="3"/>
-        </w:numPr>
-      </w:pPr>
-      <w:r>
-        <w:t>I have led several of these changes</w:t>
-      </w:r>
-    </w:p>
-    <w:p>
-      <w:pPr>
-        <w:pStyle w:val="ListParagraph"/>
-        <w:numPr>
-          <w:ilvl w:val="0"/>
-          <w:numId w:val="3"/>
-        </w:numPr>
-      </w:pPr>
-      <w:r>
-        <w:t>Upcoming changes</w:t>
+      <w:r>
+        <w:t xml:space="preserve">USAFA’s mandate includes providing an exceptional education and recognition as a recognized elite academic institution. </w:t>
+      </w:r>
+      <w:r>
+        <w:t>The Engineering Division</w:t>
+      </w:r>
+      <w:r>
+        <w:t xml:space="preserve"> participates in</w:t>
+      </w:r>
+      <w:r>
+        <w:t xml:space="preserve"> periodic ABET visits </w:t>
+      </w:r>
+      <w:r>
+        <w:t xml:space="preserve">to maintain accreditation as a form of credible external validation of USAFA’s educational excellence. </w:t>
+      </w:r>
+      <w:r>
+        <w:t xml:space="preserve">The Permanent Professor of Astronautics ensures accreditation by hiring qualified faculty and ensuring the Department meets all program guidelines. My experience and education qualify me to teach Astronautical Engineering and have prepared me well to </w:t>
+      </w:r>
+      <w:r>
+        <w:t>lead</w:t>
+      </w:r>
+      <w:r>
+        <w:t xml:space="preserve"> the Department’s ongoing </w:t>
+      </w:r>
+      <w:r>
+        <w:t xml:space="preserve">pursuit of </w:t>
+      </w:r>
+      <w:r>
+        <w:t xml:space="preserve">excellence. </w:t>
       </w:r>
     </w:p>
     <w:p/>
-    <w:p>
-      <w:r>
-        <w:t xml:space="preserve">USAFA’s mandate includes providing an exceptional education and recognition as a recognized elite academic institution. ABET accreditation provides credible </w:t>
-      </w:r>
-      <w:r>
-        <w:t xml:space="preserve">evidence of the excellence USAFA already strives to achieve. The Engineering Division completes periodic ABET visits to maintain accreditation. The Permanent Professor of Astronautics ensures program accreditation by hiring qualified faculty and ensuring the Department meets all ABET program guidelines. </w:t>
-      </w:r>
-    </w:p>
-    <w:p>
-      <w:r>
-        <w:t xml:space="preserve">My experience and education qualify me to teach Astronautical Engineering and have prepared me well to oversee the Department’s ongoing accreditation (/excellence). </w:t>
-      </w:r>
-    </w:p>
     <w:p>
       <w:r>
         <w:t xml:space="preserve">I have three relevant ABET-accredited engineering degrees. </w:t>
@@ -105,7 +49,16 @@
         </w:numPr>
       </w:pPr>
       <w:r>
-        <w:t xml:space="preserve">A BS in Engineering Mechanics (USAFA, 2006) prepared me for hands-on engineering work in Air Force assignments. </w:t>
+        <w:t xml:space="preserve">BS in Engineering Mechanics (USAFA, 2006) </w:t>
+      </w:r>
+      <w:r>
+        <w:t xml:space="preserve">provided a foundation for engineering thinking and </w:t>
+      </w:r>
+      <w:r>
+        <w:t>prepared me for hands-on engineering in Air Force assignments</w:t>
+      </w:r>
+      <w:r>
+        <w:t>.</w:t>
       </w:r>
     </w:p>
     <w:p>
@@ -117,185 +70,536 @@
         </w:numPr>
       </w:pPr>
       <w:r>
-        <w:t xml:space="preserve">A MS in Astronautical Engineering provided depth </w:t>
+        <w:t>MS in Astronautical Engineering</w:t>
+      </w:r>
+      <w:r>
+        <w:t xml:space="preserve"> (AFIT, 2011)</w:t>
+      </w:r>
+      <w:r>
+        <w:t xml:space="preserve"> introduced me to the basics of</w:t>
+      </w:r>
+      <w:r>
+        <w:t xml:space="preserve"> space</w:t>
+      </w:r>
+      <w:r>
+        <w:t xml:space="preserve"> engineering</w:t>
+      </w:r>
+      <w:r>
+        <w:t>.</w:t>
       </w:r>
     </w:p>
     <w:p>
-      <w:r>
-        <w:t xml:space="preserve"> Department of Astronautics hires qualified faculty members and undergoes periodic accreditation visits. The </w:t>
-      </w:r>
-    </w:p>
-    <w:p/>
-    <w:p/>
-    <w:p>
-      <w:r>
-        <w:t xml:space="preserve"> that end, USAFA’s Astronautical Engineering program </w:t>
-      </w:r>
-      <w:proofErr w:type="spellStart"/>
-      <w:r>
-        <w:t>recives</w:t>
-      </w:r>
-      <w:proofErr w:type="spellEnd"/>
-    </w:p>
-    <w:p/>
-    <w:p/>
-    <w:p>
-      <w:r>
-        <w:t>Exceptional education through accredited…</w:t>
+      <w:pPr>
+        <w:pStyle w:val="ListParagraph"/>
+        <w:numPr>
+          <w:ilvl w:val="0"/>
+          <w:numId w:val="5"/>
+        </w:numPr>
+      </w:pPr>
+      <w:r>
+        <w:t xml:space="preserve">PhD in Aerospace Engineering gave me the freedom to pursue independent learning and </w:t>
+      </w:r>
+      <w:r>
+        <w:t xml:space="preserve">deep </w:t>
+      </w:r>
+      <w:r>
+        <w:t>expertise in spacecraft component testing</w:t>
+      </w:r>
+      <w:r>
+        <w:t>.</w:t>
       </w:r>
     </w:p>
     <w:p>
       <w:r>
-        <w:t>Desire for self-improvement</w:t>
+        <w:t>In addition, I have experience in engineering education from two teaching assignments at USAFA</w:t>
+      </w:r>
+      <w:r>
+        <w:t xml:space="preserve"> (</w:t>
+      </w:r>
+      <w:r>
+        <w:t>2014–2016</w:t>
+      </w:r>
+      <w:r>
+        <w:t xml:space="preserve">, </w:t>
+      </w:r>
+      <w:r>
+        <w:t>2022–present</w:t>
+      </w:r>
+      <w:r>
+        <w:t xml:space="preserve">) including instruction, assessment, and curriculum development. </w:t>
       </w:r>
     </w:p>
     <w:p>
-      <w:r>
-        <w:t>Rigorous academic majors</w:t>
+      <w:pPr>
+        <w:pStyle w:val="ListParagraph"/>
+        <w:numPr>
+          <w:ilvl w:val="0"/>
+          <w:numId w:val="5"/>
+        </w:numPr>
+      </w:pPr>
+      <w:r>
+        <w:t>I i</w:t>
+      </w:r>
+      <w:r>
+        <w:t xml:space="preserve">nstructed six courses </w:t>
+      </w:r>
+      <w:r>
+        <w:t xml:space="preserve">in </w:t>
+      </w:r>
+      <w:r>
+        <w:t>two engineering departments</w:t>
+      </w:r>
+      <w:r>
+        <w:t xml:space="preserve"> and served as </w:t>
+      </w:r>
+      <w:r>
+        <w:t xml:space="preserve">course director </w:t>
+      </w:r>
+      <w:r>
+        <w:t>for four of them</w:t>
+      </w:r>
+      <w:r>
+        <w:t>.</w:t>
       </w:r>
     </w:p>
     <w:p>
-      <w:r>
-        <w:t>Elite college experience</w:t>
+      <w:pPr>
+        <w:pStyle w:val="ListParagraph"/>
+        <w:numPr>
+          <w:ilvl w:val="0"/>
+          <w:numId w:val="5"/>
+        </w:numPr>
+      </w:pPr>
+      <w:r>
+        <w:t xml:space="preserve">I was </w:t>
+      </w:r>
+      <w:r>
+        <w:t>Dept assessment officer for two years</w:t>
+      </w:r>
+      <w:r>
+        <w:t>, created mid-term review and annual metrics to support next ABET visit</w:t>
+      </w:r>
+      <w:r>
+        <w:t>.</w:t>
       </w:r>
     </w:p>
     <w:p>
-      <w:r>
-        <w:lastRenderedPageBreak/>
-        <w:t>Recognized elite academic institution</w:t>
+      <w:pPr>
+        <w:pStyle w:val="ListParagraph"/>
+        <w:numPr>
+          <w:ilvl w:val="0"/>
+          <w:numId w:val="5"/>
+        </w:numPr>
+      </w:pPr>
+      <w:r>
+        <w:t>I l</w:t>
+      </w:r>
+      <w:r>
+        <w:t xml:space="preserve">ed </w:t>
+      </w:r>
+      <w:r>
+        <w:t xml:space="preserve">the Engineering Division’s 2024 </w:t>
+      </w:r>
+      <w:r>
+        <w:t>Engineering Program Advisory Council</w:t>
+      </w:r>
+      <w:r>
+        <w:t xml:space="preserve"> (EPAC)</w:t>
+      </w:r>
+      <w:r>
+        <w:t xml:space="preserve">, an </w:t>
+      </w:r>
+      <w:r>
+        <w:t>external review to ensure</w:t>
+      </w:r>
+      <w:r>
+        <w:t xml:space="preserve"> all</w:t>
+      </w:r>
+      <w:r>
+        <w:t xml:space="preserve"> USAFA’s engineering programs meet </w:t>
+      </w:r>
+      <w:r>
+        <w:t>USAF and USSF needs</w:t>
+      </w:r>
+      <w:r>
+        <w:t>.</w:t>
       </w:r>
     </w:p>
     <w:p>
       <w:pPr>
-        <w:tabs>
-          <w:tab w:val="center" w:pos="4680"/>
-        </w:tabs>
-      </w:pPr>
-      <w:r>
-        <w:t xml:space="preserve">USAFA’s academic mandate is to provide an exceptional education as a recognized elite academic institution. </w:t>
-      </w:r>
-      <w:r>
-        <w:br/>
-        <w:t>Owe students…</w:t>
+        <w:pStyle w:val="ListParagraph"/>
+        <w:numPr>
+          <w:ilvl w:val="0"/>
+          <w:numId w:val="5"/>
+        </w:numPr>
+      </w:pPr>
+      <w:r>
+        <w:t>I coordinated a first discussion with the other 3 North American Universities that offer an accredited undergraduate Space Engineering degree.</w:t>
       </w:r>
     </w:p>
     <w:p>
-      <w:pPr>
-        <w:tabs>
-          <w:tab w:val="center" w:pos="4680"/>
-        </w:tabs>
-      </w:pPr>
-      <w:r>
-        <w:t>ABET accreditation demonstrates credibility…</w:t>
+      <w:r>
+        <w:t xml:space="preserve">My non-academic jobs have also prepared me to credibly lead an ABET-accredited engineering program. </w:t>
       </w:r>
     </w:p>
     <w:p>
       <w:pPr>
-        <w:tabs>
-          <w:tab w:val="center" w:pos="4680"/>
-        </w:tabs>
-      </w:pPr>
-      <w:r>
-        <w:t xml:space="preserve"> to ensure that our Astronautical Engineering </w:t>
+        <w:pStyle w:val="ListParagraph"/>
+        <w:numPr>
+          <w:ilvl w:val="0"/>
+          <w:numId w:val="5"/>
+        </w:numPr>
+      </w:pPr>
+      <w:r>
+        <w:t>At Holloman AFB</w:t>
+      </w:r>
+      <w:r>
+        <w:t xml:space="preserve"> </w:t>
+      </w:r>
+      <w:r>
+        <w:t xml:space="preserve">I learned engineering practice performing </w:t>
+      </w:r>
+      <w:r>
+        <w:t>hands-</w:t>
+      </w:r>
+      <w:r>
+        <w:t>on work</w:t>
+      </w:r>
+      <w:r>
+        <w:t xml:space="preserve"> in flight test and rocket sled test</w:t>
+      </w:r>
+      <w:r>
+        <w:t>.</w:t>
       </w:r>
     </w:p>
     <w:p>
-      <w:r>
-        <w:t>first ABET-accredited Astro degree, 1973</w:t>
+      <w:pPr>
+        <w:pStyle w:val="ListParagraph"/>
+        <w:numPr>
+          <w:ilvl w:val="0"/>
+          <w:numId w:val="5"/>
+        </w:numPr>
+      </w:pPr>
+      <w:r>
+        <w:t>At Los Angeles AFB I learned space acquisition and operations and cemented space lessons from AFIT</w:t>
+      </w:r>
+      <w:r>
+        <w:t>.</w:t>
       </w:r>
     </w:p>
     <w:p>
-      <w:r>
-        <w:t>USAFA has been a leader in space, ABET accreditation provides external recognition…</w:t>
+      <w:pPr>
+        <w:pStyle w:val="ListParagraph"/>
+        <w:numPr>
+          <w:ilvl w:val="0"/>
+          <w:numId w:val="5"/>
+        </w:numPr>
+      </w:pPr>
+      <w:r>
+        <w:lastRenderedPageBreak/>
+        <w:t>During a DIA assignment in Charlottesville VA I gained invaluable leadership experience, re-establishing a 2</w:t>
+      </w:r>
+      <w:r>
+        <w:t>9</w:t>
+      </w:r>
+      <w:r>
+        <w:t>-person branch after COVID and fixing long-standing cultural problems</w:t>
+      </w:r>
+      <w:r>
+        <w:t>.</w:t>
+      </w:r>
+    </w:p>
+    <w:p>
+      <w:pPr>
+        <w:pStyle w:val="ListParagraph"/>
+        <w:numPr>
+          <w:ilvl w:val="0"/>
+          <w:numId w:val="5"/>
+        </w:numPr>
+      </w:pPr>
+      <w:r>
+        <w:t xml:space="preserve">As Acting </w:t>
+      </w:r>
+      <w:r>
+        <w:t xml:space="preserve">Cadet Squadron </w:t>
+      </w:r>
+      <w:r>
+        <w:t xml:space="preserve">Commander I </w:t>
+      </w:r>
+      <w:r>
+        <w:t xml:space="preserve">directly </w:t>
+      </w:r>
+      <w:r>
+        <w:t>fulfilled</w:t>
+      </w:r>
+      <w:r>
+        <w:t xml:space="preserve"> USAFA’s military education mission</w:t>
+      </w:r>
+      <w:r>
+        <w:t xml:space="preserve"> by leading 4 NCOs and 187 cadets</w:t>
+      </w:r>
+      <w:r>
+        <w:t>.</w:t>
       </w:r>
     </w:p>
     <w:p/>
     <w:p>
       <w:r>
-        <w:t xml:space="preserve">ABET Accreditation is the foundation of credibility for American Engineering Education. ABET requires that faculty have the qualifications and authority required to guide the program, and lists several criteria used for assessing faculty competence. I believe I have the qualifications and experience to excel at guiding USAFA’s Astronautics Faculty in continued excellence at offering America’s premiere undergraduate Astronautical Engineering program. </w:t>
+        <w:t xml:space="preserve">Sustaining </w:t>
+      </w:r>
+      <w:r>
+        <w:t>the</w:t>
+      </w:r>
+      <w:r>
+        <w:t xml:space="preserve"> culture of educational </w:t>
+      </w:r>
+      <w:r>
+        <w:t>e</w:t>
+      </w:r>
+      <w:r>
+        <w:t>xcellence</w:t>
+      </w:r>
+      <w:r>
+        <w:t xml:space="preserve"> </w:t>
+      </w:r>
+      <w:r>
+        <w:t xml:space="preserve">necessary for ABET accreditation </w:t>
+      </w:r>
+      <w:r>
+        <w:t>requires continuous work</w:t>
+      </w:r>
+      <w:r>
+        <w:t xml:space="preserve">. </w:t>
+      </w:r>
+      <w:r>
+        <w:t xml:space="preserve">First, </w:t>
+      </w:r>
+      <w:r>
+        <w:t xml:space="preserve">the department must </w:t>
+      </w:r>
+      <w:r>
+        <w:t>continually</w:t>
+      </w:r>
+      <w:r>
+        <w:t xml:space="preserve"> recruit and develop</w:t>
+      </w:r>
+      <w:r>
+        <w:t xml:space="preserve"> </w:t>
+      </w:r>
+      <w:r>
+        <w:t xml:space="preserve">qualified </w:t>
+      </w:r>
+      <w:r>
+        <w:t>faculty</w:t>
+      </w:r>
+      <w:r>
+        <w:t xml:space="preserve"> members. </w:t>
+      </w:r>
+      <w:r>
+        <w:t>In addition, the</w:t>
+      </w:r>
+      <w:r>
+        <w:t xml:space="preserve"> department must balance the embrace of relevant changes in engineering practice with the need to maintain excellence in engineering fundamentals.</w:t>
       </w:r>
     </w:p>
     <w:p>
       <w:r>
-        <w:t xml:space="preserve">My career has been tailor-made to prepare me for this role, in both academic and operational (support? Non-academic) assignments. </w:t>
+        <w:t>Personnel d</w:t>
+      </w:r>
+      <w:r>
+        <w:t>evelopment is a unique institutional challenge with the short-term nature of officer assignments</w:t>
+      </w:r>
+      <w:r>
+        <w:t xml:space="preserve">. And while it provides </w:t>
+      </w:r>
+      <w:r>
+        <w:t xml:space="preserve">a constant </w:t>
+      </w:r>
+      <w:r>
+        <w:t xml:space="preserve">infusion </w:t>
+      </w:r>
+      <w:r>
+        <w:t xml:space="preserve">of </w:t>
+      </w:r>
+      <w:r>
+        <w:t xml:space="preserve">fresh engineering practices, </w:t>
+      </w:r>
+      <w:r>
+        <w:t>sustainably incorporat</w:t>
+      </w:r>
+      <w:r>
+        <w:t>ing</w:t>
+      </w:r>
+      <w:r>
+        <w:t xml:space="preserve"> those practices into coursework</w:t>
+      </w:r>
+      <w:r>
+        <w:t xml:space="preserve"> requires focused and sustained effort</w:t>
+      </w:r>
+      <w:r>
+        <w:t xml:space="preserve">. I have significant experience identifying areas for improvement and updating courses to keep pace with engineering practice. </w:t>
       </w:r>
     </w:p>
     <w:p>
       <w:r>
-        <w:t xml:space="preserve">At Holloman AFB, my first jobs provided hands-on engineering experience that have informed all of my engineering thinking since, including a test mindset. This gave me a passion for hands-on engineering education that I have brought to USAFA and incorporated into multiple classes. </w:t>
+        <w:t xml:space="preserve">As course director of Astro 331 (Space Systems Engineering) I replaced legacy proprietary hardware </w:t>
+      </w:r>
+      <w:r>
+        <w:t xml:space="preserve">with modern equipment, which also required rewriting lab content. This update created </w:t>
+      </w:r>
+      <w:r>
+        <w:t xml:space="preserve">additional </w:t>
+      </w:r>
+      <w:proofErr w:type="gramStart"/>
+      <w:r>
+        <w:t>opportunity</w:t>
+      </w:r>
+      <w:proofErr w:type="gramEnd"/>
+      <w:r>
+        <w:t xml:space="preserve"> for hands-on </w:t>
+      </w:r>
+      <w:proofErr w:type="gramStart"/>
+      <w:r>
+        <w:t>engineering, and</w:t>
+      </w:r>
+      <w:proofErr w:type="gramEnd"/>
+      <w:r>
+        <w:t xml:space="preserve"> provided </w:t>
+      </w:r>
+      <w:r>
+        <w:t>room</w:t>
+      </w:r>
+      <w:r>
+        <w:t xml:space="preserve"> for cadets to learn fundamental engineering concepts at a deeper level than before. </w:t>
       </w:r>
     </w:p>
     <w:p>
       <w:r>
-        <w:t xml:space="preserve">At Los Angeles AFB I performed my first jobs in space. I learned rapidly and developed a love for space. Despite being at a program office, both jobs I filled uniquely involved frequent on-site work with missile warning operators (2 SWS). </w:t>
+        <w:t xml:space="preserve">As Division EPAC coordinator, I identified a common </w:t>
+      </w:r>
+      <w:r>
+        <w:t xml:space="preserve">curriculum </w:t>
+      </w:r>
+      <w:r>
+        <w:t xml:space="preserve">shortfall in engineering communication. I </w:t>
+      </w:r>
+      <w:r>
+        <w:t xml:space="preserve">pursued a </w:t>
+      </w:r>
+      <w:r>
+        <w:t>mult</w:t>
+      </w:r>
+      <w:r>
+        <w:t>i-</w:t>
+      </w:r>
+      <w:r>
+        <w:t>semester</w:t>
+      </w:r>
+      <w:r>
+        <w:t xml:space="preserve"> effort</w:t>
+      </w:r>
+      <w:r>
+        <w:t xml:space="preserve"> to incorporate new material into the </w:t>
+      </w:r>
+      <w:r>
+        <w:t xml:space="preserve">Astronautical Engineering </w:t>
+      </w:r>
+      <w:r>
+        <w:t xml:space="preserve">major to address the problem, </w:t>
+      </w:r>
+      <w:r>
+        <w:t>leading</w:t>
+      </w:r>
+      <w:r>
+        <w:t xml:space="preserve"> the</w:t>
+      </w:r>
+      <w:r>
+        <w:t xml:space="preserve"> development of</w:t>
+      </w:r>
+      <w:r>
+        <w:t xml:space="preserve"> a multi-department Engr 495</w:t>
+      </w:r>
+      <w:r>
+        <w:t xml:space="preserve"> experimental course and promoting a Curriculum Change Proposal to incorporate Engr 201 (</w:t>
+      </w:r>
+      <w:r>
+        <w:t>Technology Skills and Communication for Engineers</w:t>
+      </w:r>
+      <w:r>
+        <w:t>) into USAFA’s Course of Instruction</w:t>
+      </w:r>
+      <w:r>
+        <w:t xml:space="preserve"> (COI)</w:t>
+      </w:r>
+      <w:r>
+        <w:t xml:space="preserve"> as a required class for two engineering majors, currently on track to begin in Fall 2026. </w:t>
+      </w:r>
+    </w:p>
+    <w:p/>
+    <w:p>
+      <w:r>
+        <w:t xml:space="preserve">USAFA has long been a recognized leader in space education. </w:t>
+      </w:r>
+      <w:proofErr w:type="gramStart"/>
+      <w:r>
+        <w:t>The Astronautical</w:t>
+      </w:r>
+      <w:proofErr w:type="gramEnd"/>
+      <w:r>
+        <w:t xml:space="preserve"> Engineering major </w:t>
+      </w:r>
+      <w:r>
+        <w:t>was the first of its kind to receive ABET accreditation in 1973. The program has also produced multiple foundational textbooks</w:t>
+      </w:r>
+      <w:r>
+        <w:t xml:space="preserve">. The department has also launched </w:t>
+      </w:r>
+      <w:r>
+        <w:t xml:space="preserve">a series of successful </w:t>
+      </w:r>
+      <w:proofErr w:type="spellStart"/>
+      <w:r>
+        <w:t>FalconSAT</w:t>
+      </w:r>
+      <w:proofErr w:type="spellEnd"/>
+      <w:r>
+        <w:t xml:space="preserve"> spacecraft that have introduced major engineering advances. </w:t>
+      </w:r>
+    </w:p>
+    <w:p/>
+    <w:p>
+      <w:r>
+        <w:lastRenderedPageBreak/>
+        <w:t xml:space="preserve">While USAFA is well positioned to maintain its </w:t>
+      </w:r>
+      <w:r>
+        <w:t>cultural legacy of excellence and leadership in space education</w:t>
+      </w:r>
+      <w:r>
+        <w:t xml:space="preserve">, the Department must continue to stay abreast of several changes in the field. In the near term, USAFA needs a Curriculum Change Proposal to update the </w:t>
+      </w:r>
+      <w:r>
+        <w:t>COI’s description of the Astronautical Engineering major</w:t>
+      </w:r>
+      <w:r>
+        <w:t>, which directly lists</w:t>
+      </w:r>
+      <w:r>
+        <w:t xml:space="preserve"> ABET’s Curriculum requirements</w:t>
+      </w:r>
+      <w:r>
+        <w:t xml:space="preserve">. </w:t>
+      </w:r>
+      <w:r>
+        <w:t xml:space="preserve">ABET has updated these requirements for 2026 and beyond, which will subtly change program instruction and assessment. </w:t>
       </w:r>
     </w:p>
     <w:p>
       <w:r>
-        <w:t>My Defense Intelligence Agency job provided valuable experience leading a small team</w:t>
-      </w:r>
-      <w:r>
-        <w:t xml:space="preserve">. </w:t>
-      </w:r>
-    </w:p>
-    <w:p>
-      <w:r>
-        <w:t>My educational qualifications:</w:t>
-      </w:r>
-    </w:p>
-    <w:p>
-      <w:r>
-        <w:t xml:space="preserve">3 ABET-accredited degrees. </w:t>
-      </w:r>
-    </w:p>
-    <w:p>
-      <w:r>
-        <w:t xml:space="preserve">USAFA Engineering Mechanics degree foundational to the way I think as an engineer and prepared me well for my flight test work. </w:t>
-      </w:r>
-    </w:p>
-    <w:p>
-      <w:r>
-        <w:t>AFIT Astronautical Engineering degree introduced me to space with its inherently interdisciplinary…</w:t>
-      </w:r>
-    </w:p>
-    <w:p>
-      <w:r>
-        <w:lastRenderedPageBreak/>
-        <w:t xml:space="preserve">NCSU Aerospace Engineering gave me freedom to deeply investigate one problem. In addition to the academics, it was an explicit leadership challenge in many ways. I led a team of XX people to put together my research project. I coordinated last-minute support of AFROCT Det 595 when CC got fired. </w:t>
-      </w:r>
-    </w:p>
-    <w:p>
-      <w:r>
-        <w:t xml:space="preserve">Finally, I have spent several years developing teaching expertise, both classroom teaching and supporting the department, the program, and USAFA as an institution. </w:t>
-      </w:r>
-    </w:p>
-    <w:p>
-      <w:r>
-        <w:t xml:space="preserve">In my first USAFA assignment I focused on good course direction and instruction, including guest teaching in the Engineering Mechanics Department. </w:t>
-      </w:r>
-    </w:p>
-    <w:p>
-      <w:r>
-        <w:t xml:space="preserve">During my second assignment I </w:t>
-      </w:r>
-      <w:r>
-        <w:t xml:space="preserve">have </w:t>
-      </w:r>
-      <w:proofErr w:type="spellStart"/>
-      <w:r>
-        <w:t>asdfafd</w:t>
-      </w:r>
-      <w:proofErr w:type="spellEnd"/>
-    </w:p>
-    <w:p>
-      <w:r>
-        <w:br w:type="page"/>
-      </w:r>
-    </w:p>
-    <w:p>
-      <w:r>
-        <w:lastRenderedPageBreak/>
-        <w:t xml:space="preserve">Three ABET-accredited engineering degrees provide the foundation of my academic qualifications. </w:t>
+        <w:t>If selected as Permanent Professor of Astronautics, I also intend to maintain USAFA’s leadership in Space Engineering educatio</w:t>
+      </w:r>
+      <w:r>
+        <w:t>n with the following initiatives.</w:t>
       </w:r>
     </w:p>
     <w:p>
@@ -303,11 +607,11 @@
         <w:pStyle w:val="ListParagraph"/>
         <w:numPr>
           <w:ilvl w:val="0"/>
-          <w:numId w:val="2"/>
+          <w:numId w:val="5"/>
         </w:numPr>
       </w:pPr>
       <w:r>
-        <w:t>BS in Engineering Mechanics served as a foundation to thinking like an engineer, and prepared me for hands-on engineering in my early assignments</w:t>
+        <w:t xml:space="preserve">Obtain a permanent USSF 13S (Space Operations) billet for the Department to maintain a fresh connection to operational Space Force needs. </w:t>
       </w:r>
     </w:p>
     <w:p>
@@ -315,11 +619,50 @@
         <w:pStyle w:val="ListParagraph"/>
         <w:numPr>
           <w:ilvl w:val="0"/>
-          <w:numId w:val="2"/>
+          <w:numId w:val="5"/>
         </w:numPr>
       </w:pPr>
       <w:r>
-        <w:t xml:space="preserve">MS in Astronautical Engineering introduced me to space as a discipline, and the inherently interdisciplinary nature of space engineering. This degree also prepared me to quickly understand the space environment during my subsequent space assignments. </w:t>
+        <w:t>U</w:t>
+      </w:r>
+      <w:r>
+        <w:t xml:space="preserve">pdate foundational </w:t>
+      </w:r>
+      <w:r>
+        <w:t xml:space="preserve">field </w:t>
+      </w:r>
+      <w:r>
+        <w:t xml:space="preserve">textbooks. Many of these books were developed by USAFA but are due </w:t>
+      </w:r>
+      <w:proofErr w:type="gramStart"/>
+      <w:r>
+        <w:t>for</w:t>
+      </w:r>
+      <w:proofErr w:type="gramEnd"/>
+      <w:r>
+        <w:t xml:space="preserve"> a </w:t>
+      </w:r>
+      <w:proofErr w:type="gramStart"/>
+      <w:r>
+        <w:t>refresh</w:t>
+      </w:r>
+      <w:proofErr w:type="gramEnd"/>
+      <w:r>
+        <w:t xml:space="preserve"> </w:t>
+      </w:r>
+      <w:proofErr w:type="gramStart"/>
+      <w:r>
+        <w:t xml:space="preserve">to </w:t>
+      </w:r>
+      <w:r>
+        <w:t>track</w:t>
+      </w:r>
+      <w:r>
+        <w:t xml:space="preserve"> developments</w:t>
+      </w:r>
+      <w:proofErr w:type="gramEnd"/>
+      <w:r>
+        <w:t xml:space="preserve"> in a rapidly changing industry. </w:t>
       </w:r>
     </w:p>
     <w:p>
@@ -327,92 +670,28 @@
         <w:pStyle w:val="ListParagraph"/>
         <w:numPr>
           <w:ilvl w:val="0"/>
-          <w:numId w:val="2"/>
+          <w:numId w:val="5"/>
         </w:numPr>
       </w:pPr>
       <w:r>
-        <w:t>PhD in Aerospace Engineering gave me the freedom to pursue depth and independence as I tackled a new problem, developed a spacecraft component, and led a team to develop and test it</w:t>
-      </w:r>
-    </w:p>
-    <w:p>
-      <w:r>
-        <w:t xml:space="preserve">I also have significant experience as an educator, developing expertise in the classroom and beyond. </w:t>
-      </w:r>
-    </w:p>
-    <w:p>
-      <w:pPr>
-        <w:pStyle w:val="ListParagraph"/>
-        <w:numPr>
-          <w:ilvl w:val="0"/>
-          <w:numId w:val="2"/>
-        </w:numPr>
-      </w:pPr>
-      <w:r>
-        <w:t>USAFA classroom instruction</w:t>
-      </w:r>
-    </w:p>
-    <w:p>
-      <w:pPr>
-        <w:pStyle w:val="ListParagraph"/>
-        <w:numPr>
-          <w:ilvl w:val="0"/>
-          <w:numId w:val="2"/>
-        </w:numPr>
-      </w:pPr>
-      <w:r>
-        <w:t>AT NCSU’s AFROTC Det 595 I coordinated among AFIT CI students to provide coverage of 3 semester-long classes…</w:t>
-      </w:r>
-    </w:p>
-    <w:p>
-      <w:pPr>
-        <w:pStyle w:val="ListParagraph"/>
-        <w:numPr>
-          <w:ilvl w:val="0"/>
-          <w:numId w:val="2"/>
-        </w:numPr>
-      </w:pPr>
-      <w:r>
-        <w:t>Course development</w:t>
-      </w:r>
-    </w:p>
-    <w:p>
-      <w:pPr>
-        <w:pStyle w:val="ListParagraph"/>
-        <w:numPr>
-          <w:ilvl w:val="0"/>
-          <w:numId w:val="2"/>
-        </w:numPr>
-      </w:pPr>
-      <w:r>
-        <w:t>Accreditation</w:t>
-      </w:r>
-    </w:p>
-    <w:p>
-      <w:pPr>
-        <w:pStyle w:val="ListParagraph"/>
-      </w:pPr>
-    </w:p>
-    <w:p>
-      <w:r>
-        <w:br w:type="page"/>
-      </w:r>
-      <w:r>
-        <w:lastRenderedPageBreak/>
-        <w:t xml:space="preserve">Excellence in engineering education cannot be a static endeavor. In addition to the ongoing work of developing faculty, the Department must continually stay abreast of changes in a rapidly-developing field. </w:t>
-      </w:r>
-    </w:p>
-    <w:p>
-      <w:r>
-        <w:t>As an instructor I have successfully introduced several changes into curriculum…</w:t>
+        <w:t>Promote regular discourse with other schools that offer specialized space engineering programs.</w:t>
       </w:r>
     </w:p>
     <w:p/>
     <w:p>
       <w:r>
-        <w:t>Ongoing…</w:t>
+        <w:t xml:space="preserve">USAFA </w:t>
+      </w:r>
+      <w:r>
+        <w:t xml:space="preserve">provides unparalleled leadership in space education and has taught Astronautical Engineering to more graduates than any other institution. I will be proud to sustain this legacy and ensure USAFA continues to </w:t>
+      </w:r>
+      <w:r>
+        <w:t>offer the nation’s premiere Astronautical Engineering degree</w:t>
+      </w:r>
+      <w:r>
+        <w:t xml:space="preserve">. </w:t>
       </w:r>
     </w:p>
-    <w:p/>
     <w:sectPr>
       <w:pgSz w:w="12240" w:h="15840"/>
       <w:pgMar w:top="1440" w:right="1440" w:bottom="1440" w:left="1440" w:header="720" w:footer="720" w:gutter="0"/>
@@ -651,6 +930,118 @@
     </w:lvl>
   </w:abstractNum>
   <w:abstractNum w:abstractNumId="2" w15:restartNumberingAfterBreak="0">
+    <w:nsid w:val="50755E88"/>
+    <w:multiLevelType w:val="hybridMultilevel"/>
+    <w:tmpl w:val="0ABE6DBC"/>
+    <w:lvl w:ilvl="0" w:tplc="B3C06572">
+      <w:numFmt w:val="bullet"/>
+      <w:lvlText w:val="-"/>
+      <w:lvlJc w:val="left"/>
+      <w:pPr>
+        <w:ind w:left="720" w:hanging="360"/>
+      </w:pPr>
+      <w:rPr>
+        <w:rFonts w:ascii="Aptos" w:eastAsiaTheme="minorHAnsi" w:hAnsi="Aptos" w:cstheme="minorBidi" w:hint="default"/>
+      </w:rPr>
+    </w:lvl>
+    <w:lvl w:ilvl="1" w:tplc="04090003" w:tentative="1">
+      <w:start w:val="1"/>
+      <w:numFmt w:val="bullet"/>
+      <w:lvlText w:val="o"/>
+      <w:lvlJc w:val="left"/>
+      <w:pPr>
+        <w:ind w:left="1440" w:hanging="360"/>
+      </w:pPr>
+      <w:rPr>
+        <w:rFonts w:ascii="Courier New" w:hAnsi="Courier New" w:cs="Courier New" w:hint="default"/>
+      </w:rPr>
+    </w:lvl>
+    <w:lvl w:ilvl="2" w:tplc="04090005" w:tentative="1">
+      <w:start w:val="1"/>
+      <w:numFmt w:val="bullet"/>
+      <w:lvlText w:val=""/>
+      <w:lvlJc w:val="left"/>
+      <w:pPr>
+        <w:ind w:left="2160" w:hanging="360"/>
+      </w:pPr>
+      <w:rPr>
+        <w:rFonts w:ascii="Wingdings" w:hAnsi="Wingdings" w:hint="default"/>
+      </w:rPr>
+    </w:lvl>
+    <w:lvl w:ilvl="3" w:tplc="04090001" w:tentative="1">
+      <w:start w:val="1"/>
+      <w:numFmt w:val="bullet"/>
+      <w:lvlText w:val=""/>
+      <w:lvlJc w:val="left"/>
+      <w:pPr>
+        <w:ind w:left="2880" w:hanging="360"/>
+      </w:pPr>
+      <w:rPr>
+        <w:rFonts w:ascii="Symbol" w:hAnsi="Symbol" w:hint="default"/>
+      </w:rPr>
+    </w:lvl>
+    <w:lvl w:ilvl="4" w:tplc="04090003" w:tentative="1">
+      <w:start w:val="1"/>
+      <w:numFmt w:val="bullet"/>
+      <w:lvlText w:val="o"/>
+      <w:lvlJc w:val="left"/>
+      <w:pPr>
+        <w:ind w:left="3600" w:hanging="360"/>
+      </w:pPr>
+      <w:rPr>
+        <w:rFonts w:ascii="Courier New" w:hAnsi="Courier New" w:cs="Courier New" w:hint="default"/>
+      </w:rPr>
+    </w:lvl>
+    <w:lvl w:ilvl="5" w:tplc="04090005" w:tentative="1">
+      <w:start w:val="1"/>
+      <w:numFmt w:val="bullet"/>
+      <w:lvlText w:val=""/>
+      <w:lvlJc w:val="left"/>
+      <w:pPr>
+        <w:ind w:left="4320" w:hanging="360"/>
+      </w:pPr>
+      <w:rPr>
+        <w:rFonts w:ascii="Wingdings" w:hAnsi="Wingdings" w:hint="default"/>
+      </w:rPr>
+    </w:lvl>
+    <w:lvl w:ilvl="6" w:tplc="04090001" w:tentative="1">
+      <w:start w:val="1"/>
+      <w:numFmt w:val="bullet"/>
+      <w:lvlText w:val=""/>
+      <w:lvlJc w:val="left"/>
+      <w:pPr>
+        <w:ind w:left="5040" w:hanging="360"/>
+      </w:pPr>
+      <w:rPr>
+        <w:rFonts w:ascii="Symbol" w:hAnsi="Symbol" w:hint="default"/>
+      </w:rPr>
+    </w:lvl>
+    <w:lvl w:ilvl="7" w:tplc="04090003" w:tentative="1">
+      <w:start w:val="1"/>
+      <w:numFmt w:val="bullet"/>
+      <w:lvlText w:val="o"/>
+      <w:lvlJc w:val="left"/>
+      <w:pPr>
+        <w:ind w:left="5760" w:hanging="360"/>
+      </w:pPr>
+      <w:rPr>
+        <w:rFonts w:ascii="Courier New" w:hAnsi="Courier New" w:cs="Courier New" w:hint="default"/>
+      </w:rPr>
+    </w:lvl>
+    <w:lvl w:ilvl="8" w:tplc="04090005" w:tentative="1">
+      <w:start w:val="1"/>
+      <w:numFmt w:val="bullet"/>
+      <w:lvlText w:val=""/>
+      <w:lvlJc w:val="left"/>
+      <w:pPr>
+        <w:ind w:left="6480" w:hanging="360"/>
+      </w:pPr>
+      <w:rPr>
+        <w:rFonts w:ascii="Wingdings" w:hAnsi="Wingdings" w:hint="default"/>
+      </w:rPr>
+    </w:lvl>
+  </w:abstractNum>
+  <w:abstractNum w:abstractNumId="3" w15:restartNumberingAfterBreak="0">
     <w:nsid w:val="65BB0752"/>
     <w:multiLevelType w:val="hybridMultilevel"/>
     <w:tmpl w:val="02A823BA"/>
@@ -666,7 +1057,7 @@
         <w:rFonts w:ascii="Symbol" w:hAnsi="Symbol" w:hint="default"/>
       </w:rPr>
     </w:lvl>
-    <w:lvl w:ilvl="1" w:tplc="04090003" w:tentative="1">
+    <w:lvl w:ilvl="1" w:tplc="04090003">
       <w:start w:val="1"/>
       <w:numFmt w:val="bullet"/>
       <w:lvlText w:val="o"/>
@@ -763,7 +1154,7 @@
       </w:rPr>
     </w:lvl>
   </w:abstractNum>
-  <w:abstractNum w:abstractNumId="3" w15:restartNumberingAfterBreak="0">
+  <w:abstractNum w:abstractNumId="4" w15:restartNumberingAfterBreak="0">
     <w:nsid w:val="697D2511"/>
     <w:multiLevelType w:val="hybridMultilevel"/>
     <w:tmpl w:val="F766A29E"/>
@@ -876,7 +1267,7 @@
       </w:rPr>
     </w:lvl>
   </w:abstractNum>
-  <w:abstractNum w:abstractNumId="4" w15:restartNumberingAfterBreak="0">
+  <w:abstractNum w:abstractNumId="5" w15:restartNumberingAfterBreak="0">
     <w:nsid w:val="6EBB510B"/>
     <w:multiLevelType w:val="hybridMultilevel"/>
     <w:tmpl w:val="5D60882E"/>
@@ -993,15 +1384,18 @@
     <w:abstractNumId w:val="0"/>
   </w:num>
   <w:num w:numId="2" w16cid:durableId="881331341">
-    <w:abstractNumId w:val="3"/>
+    <w:abstractNumId w:val="4"/>
   </w:num>
   <w:num w:numId="3" w16cid:durableId="1064914100">
-    <w:abstractNumId w:val="4"/>
+    <w:abstractNumId w:val="5"/>
   </w:num>
   <w:num w:numId="4" w16cid:durableId="624897245">
     <w:abstractNumId w:val="1"/>
   </w:num>
   <w:num w:numId="5" w16cid:durableId="42560358">
+    <w:abstractNumId w:val="3"/>
+  </w:num>
+  <w:num w:numId="6" w16cid:durableId="1521047267">
     <w:abstractNumId w:val="2"/>
   </w:num>
 </w:numbering>
@@ -1407,6 +1801,7 @@
   <w:style w:type="paragraph" w:default="1" w:styleId="Normal">
     <w:name w:val="Normal"/>
     <w:qFormat/>
+    <w:rsid w:val="004053BB"/>
   </w:style>
   <w:style w:type="paragraph" w:styleId="Heading1">
     <w:name w:val="heading 1"/>

</xml_diff>